<commit_message>
docs(standards): break the format guidance into bullets
The choose-your-format paragraph carried three separate points -- markdown is
plain text and diffs, markdown is what you hand an agent, Word is for people who
will not adopt it -- in one block a reader skims past. They are bullets now, one
point each, which is how the rest of this page reads.

The agent line is widened from one product to "Claude Code, or any coding agent",
because nothing about the format is specific to one tool.

Word copy regenerated in the same commit. The pin added alongside these files
compares headings, so a prose-only change like this one would not have tripped
it -- which is the limitation that pin states about itself, and the reason to
regenerate by habit rather than on a red test.

Verified: check-ascii clean, leak gate exit 0, all seven test files pass, and the
new bullet text is present in the regenerated Word document.
</commit_message>
<xml_diff>
--- a/docs/standards/word/OVERVIEW.docx
+++ b/docs/standards/word/OVERVIEW.docx
@@ -510,58 +510,6 @@
         </w:rPr>
         <w:t xml:space="preserve">Take the markdown if you intend to use these.</w:t>
       </w:r>
-      <w:r>
-        <w:t xml:space="preserve"> </w:t>
-      </w:r>
-      <w:r>
-        <w:t xml:space="preserve">It is plain text: it drops into a repository,</w:t>
-      </w:r>
-      <w:r>
-        <w:t xml:space="preserve"> </w:t>
-      </w:r>
-      <w:r>
-        <w:t xml:space="preserve">diffs cleanly when you edit it, and is the right thing to hand to Claude Code as context when you</w:t>
-      </w:r>
-      <w:r>
-        <w:t xml:space="preserve"> </w:t>
-      </w:r>
-      <w:r>
-        <w:t xml:space="preserve">want a standard applied to your own code. The Word files are the same content, generated from the</w:t>
-      </w:r>
-      <w:r>
-        <w:t xml:space="preserve"> </w:t>
-      </w:r>
-      <w:r>
-        <w:t xml:space="preserve">same markdown, for circulating to people who will read or mark up rather than adopt.</w:t>
-      </w:r>
-    </w:p>
-    <w:p>
-      <w:pPr>
-        <w:pStyle w:val="BodyText"/>
-      </w:pPr>
-      <w:r>
-        <w:rPr>
-          <w:b/>
-          <w:bCs/>
-        </w:rPr>
-        <w:t xml:space="preserve">MIT licensed</w:t>
-      </w:r>
-      <w:r>
-        <w:t xml:space="preserve"> </w:t>
-      </w:r>
-      <w:r>
-        <w:t xml:space="preserve">-- adapt them, publish the result, drop the attribution.</w:t>
-      </w:r>
-    </w:p>
-    <w:bookmarkEnd w:id="23"/>
-    <w:bookmarkStart w:id="24" w:name="what-you-get"/>
-    <w:p>
-      <w:pPr>
-        <w:pStyle w:val="Heading2"/>
-      </w:pPr>
-      <w:r>
-        <w:t xml:space="preserve">What you get</w:t>
-      </w:r>
     </w:p>
     <w:p>
       <w:pPr>
@@ -576,28 +524,19 @@
           <w:b/>
           <w:bCs/>
         </w:rPr>
-        <w:t xml:space="preserve">A rubric you can run against your own repository at each release</w:t>
-      </w:r>
-      <w:r>
-        <w:t xml:space="preserve">, split into controls that may</w:t>
-      </w:r>
-      <w:r>
-        <w:t xml:space="preserve"> </w:t>
-      </w:r>
-      <w:r>
-        <w:t xml:space="preserve">decide a verdict and measurements that may only start a conversation -- so an argument about "is</w:t>
-      </w:r>
-      <w:r>
-        <w:t xml:space="preserve"> </w:t>
-      </w:r>
-      <w:r>
-        <w:t xml:space="preserve">this good enough" resolves against structure rather than against whoever quotes the largest</w:t>
-      </w:r>
-      <w:r>
-        <w:t xml:space="preserve"> </w:t>
-      </w:r>
-      <w:r>
-        <w:t xml:space="preserve">number.</w:t>
+        <w:t xml:space="preserve">It is plain text.</w:t>
+      </w:r>
+      <w:r>
+        <w:t xml:space="preserve"> </w:t>
+      </w:r>
+      <w:r>
+        <w:t xml:space="preserve">It drops into a repository as-is, and it diffs cleanly once you start</w:t>
+      </w:r>
+      <w:r>
+        <w:t xml:space="preserve"> </w:t>
+      </w:r>
+      <w:r>
+        <w:t xml:space="preserve">editing it -- which you will, because none of these are usable unedited.</w:t>
       </w:r>
     </w:p>
     <w:p>
@@ -613,25 +552,16 @@
           <w:b/>
           <w:bCs/>
         </w:rPr>
-        <w:t xml:space="preserve">A discipline for third-party code that never asks you to read it.</w:t>
-      </w:r>
-      <w:r>
-        <w:t xml:space="preserve"> </w:t>
-      </w:r>
-      <w:r>
-        <w:t xml:space="preserve">The human effort lands at</w:t>
-      </w:r>
-      <w:r>
-        <w:t xml:space="preserve"> </w:t>
-      </w:r>
-      <w:r>
-        <w:t xml:space="preserve">exactly two moments -- adopting a dependency and bumping one -- and the rest is machinery that</w:t>
-      </w:r>
-      <w:r>
-        <w:t xml:space="preserve"> </w:t>
-      </w:r>
-      <w:r>
-        <w:t xml:space="preserve">runs unattended until it raises something.</w:t>
+        <w:t xml:space="preserve">It is the right thing to hand to Claude Code</w:t>
+      </w:r>
+      <w:r>
+        <w:t xml:space="preserve">, or any coding agent, as context when you want a</w:t>
+      </w:r>
+      <w:r>
+        <w:t xml:space="preserve"> </w:t>
+      </w:r>
+      <w:r>
+        <w:t xml:space="preserve">standard applied to your own code rather than just read.</w:t>
       </w:r>
     </w:p>
     <w:p>
@@ -647,150 +577,44 @@
           <w:b/>
           <w:bCs/>
         </w:rPr>
-        <w:t xml:space="preserve">A release an adopter can verify without trusting your account of your own process</w:t>
-      </w:r>
-      <w:r>
-        <w:t xml:space="preserve">, and an</w:t>
-      </w:r>
-      <w:r>
-        <w:t xml:space="preserve"> </w:t>
-      </w:r>
-      <w:r>
-        <w:t xml:space="preserve">allowlist checked before the upload rather than after it, because the upload is the irreversible</w:t>
-      </w:r>
-      <w:r>
-        <w:t xml:space="preserve"> </w:t>
-      </w:r>
-      <w:r>
-        <w:t xml:space="preserve">step.</w:t>
-      </w:r>
-    </w:p>
-    <w:p>
-      <w:pPr>
-        <w:pStyle w:val="Compact"/>
-        <w:numPr>
-          <w:ilvl w:val="0"/>
-          <w:numId w:val="1001"/>
-        </w:numPr>
+        <w:t xml:space="preserve">The Word files are the same content</w:t>
+      </w:r>
+      <w:r>
+        <w:t xml:space="preserve">, generated from the same markdown. Take those for</w:t>
+      </w:r>
+      <w:r>
+        <w:t xml:space="preserve"> </w:t>
+      </w:r>
+      <w:r>
+        <w:t xml:space="preserve">circulating to people who will read or mark up rather than adopt.</w:t>
+      </w:r>
+    </w:p>
+    <w:p>
+      <w:pPr>
+        <w:pStyle w:val="FirstParagraph"/>
       </w:pPr>
       <w:r>
         <w:rPr>
           <w:b/>
           <w:bCs/>
         </w:rPr>
-        <w:t xml:space="preserve">A written split between what you own and what an adopter owns</w:t>
-      </w:r>
-      <w:r>
-        <w:t xml:space="preserve">, before you claim any control.</w:t>
-      </w:r>
-      <w:r>
-        <w:t xml:space="preserve"> </w:t>
-      </w:r>
-      <w:r>
-        <w:t xml:space="preserve">That gap is where a control ends up unowned by both sides, each assuming the other had it.</w:t>
-      </w:r>
-    </w:p>
-    <w:p>
-      <w:pPr>
-        <w:pStyle w:val="Compact"/>
-        <w:numPr>
-          <w:ilvl w:val="0"/>
-          <w:numId w:val="1001"/>
-        </w:numPr>
-      </w:pPr>
-      <w:r>
-        <w:rPr>
-          <w:b/>
-          <w:bCs/>
-        </w:rPr>
-        <w:t xml:space="preserve">A risk tier you can resolve in one question</w:t>
-      </w:r>
-      <w:r>
-        <w:t xml:space="preserve">, so a one-line fix does not carry the same</w:t>
-      </w:r>
-      <w:r>
-        <w:t xml:space="preserve"> </w:t>
-      </w:r>
-      <w:r>
-        <w:t xml:space="preserve">obligation as a change to an authorisation path, and so the cheap answer errs strict rather than</w:t>
-      </w:r>
-      <w:r>
-        <w:t xml:space="preserve"> </w:t>
-      </w:r>
-      <w:r>
-        <w:t xml:space="preserve">convenient.</w:t>
-      </w:r>
-    </w:p>
-    <w:p>
-      <w:pPr>
-        <w:pStyle w:val="Compact"/>
-        <w:numPr>
-          <w:ilvl w:val="0"/>
-          <w:numId w:val="1001"/>
-        </w:numPr>
-      </w:pPr>
-      <w:r>
-        <w:rPr>
-          <w:b/>
-          <w:bCs/>
-        </w:rPr>
-        <w:t xml:space="preserve">Wording you can actually publish.</w:t>
-      </w:r>
-      <w:r>
-        <w:t xml:space="preserve"> </w:t>
-      </w:r>
-      <w:r>
-        <w:t xml:space="preserve">Approved phrasings next to the overclaims they replace, and</w:t>
-      </w:r>
-      <w:r>
-        <w:t xml:space="preserve"> </w:t>
-      </w:r>
-      <w:r>
-        <w:t xml:space="preserve">a rule for saying what a gate does not prove -- which is what stops a document being rejected by</w:t>
-      </w:r>
-      <w:r>
-        <w:t xml:space="preserve"> </w:t>
-      </w:r>
-      <w:r>
-        <w:t xml:space="preserve">the first reader who checks its sources.</w:t>
-      </w:r>
-    </w:p>
-    <w:p>
-      <w:pPr>
-        <w:pStyle w:val="Compact"/>
-        <w:numPr>
-          <w:ilvl w:val="0"/>
-          <w:numId w:val="1001"/>
-        </w:numPr>
-      </w:pPr>
-      <w:r>
-        <w:rPr>
-          <w:b/>
-          <w:bCs/>
-        </w:rPr>
-        <w:t xml:space="preserve">The claims that failed verification, published next to the ones that survived.</w:t>
-      </w:r>
-      <w:r>
-        <w:t xml:space="preserve"> </w:t>
-      </w:r>
-      <w:r>
-        <w:t xml:space="preserve">Specific</w:t>
-      </w:r>
-      <w:r>
-        <w:t xml:space="preserve"> </w:t>
-      </w:r>
-      <w:r>
-        <w:t xml:space="preserve">numbers to stop repeating, including several that circulate widely and did not survive the filter.</w:t>
-      </w:r>
-    </w:p>
-    <w:bookmarkEnd w:id="24"/>
-    <w:bookmarkStart w:id="26" w:name="what-these-are-not"/>
+        <w:t xml:space="preserve">MIT licensed</w:t>
+      </w:r>
+      <w:r>
+        <w:t xml:space="preserve"> </w:t>
+      </w:r>
+      <w:r>
+        <w:t xml:space="preserve">-- adapt them, publish the result, drop the attribution.</w:t>
+      </w:r>
+    </w:p>
+    <w:bookmarkEnd w:id="23"/>
+    <w:bookmarkStart w:id="24" w:name="what-you-get"/>
     <w:p>
       <w:pPr>
         <w:pStyle w:val="Heading2"/>
       </w:pPr>
       <w:r>
-        <w:t xml:space="preserve">What these are not</w:t>
+        <w:t xml:space="preserve">What you get</w:t>
       </w:r>
     </w:p>
     <w:p>
@@ -806,19 +630,28 @@
           <w:b/>
           <w:bCs/>
         </w:rPr>
-        <w:t xml:space="preserve">No code ships with them.</w:t>
-      </w:r>
-      <w:r>
-        <w:t xml:space="preserve"> </w:t>
-      </w:r>
-      <w:r>
-        <w:t xml:space="preserve">These are rules and review procedures. Where one names a control, it</w:t>
-      </w:r>
-      <w:r>
-        <w:t xml:space="preserve"> </w:t>
-      </w:r>
-      <w:r>
-        <w:t xml:space="preserve">is describing something you would build, not something in this repository.</w:t>
+        <w:t xml:space="preserve">A rubric you can run against your own repository at each release</w:t>
+      </w:r>
+      <w:r>
+        <w:t xml:space="preserve">, split into controls that may</w:t>
+      </w:r>
+      <w:r>
+        <w:t xml:space="preserve"> </w:t>
+      </w:r>
+      <w:r>
+        <w:t xml:space="preserve">decide a verdict and measurements that may only start a conversation -- so an argument about "is</w:t>
+      </w:r>
+      <w:r>
+        <w:t xml:space="preserve"> </w:t>
+      </w:r>
+      <w:r>
+        <w:t xml:space="preserve">this good enough" resolves against structure rather than against whoever quotes the largest</w:t>
+      </w:r>
+      <w:r>
+        <w:t xml:space="preserve"> </w:t>
+      </w:r>
+      <w:r>
+        <w:t xml:space="preserve">number.</w:t>
       </w:r>
     </w:p>
     <w:p>
@@ -827,6 +660,227 @@
         <w:numPr>
           <w:ilvl w:val="0"/>
           <w:numId w:val="1002"/>
+        </w:numPr>
+      </w:pPr>
+      <w:r>
+        <w:rPr>
+          <w:b/>
+          <w:bCs/>
+        </w:rPr>
+        <w:t xml:space="preserve">A discipline for third-party code that never asks you to read it.</w:t>
+      </w:r>
+      <w:r>
+        <w:t xml:space="preserve"> </w:t>
+      </w:r>
+      <w:r>
+        <w:t xml:space="preserve">The human effort lands at</w:t>
+      </w:r>
+      <w:r>
+        <w:t xml:space="preserve"> </w:t>
+      </w:r>
+      <w:r>
+        <w:t xml:space="preserve">exactly two moments -- adopting a dependency and bumping one -- and the rest is machinery that</w:t>
+      </w:r>
+      <w:r>
+        <w:t xml:space="preserve"> </w:t>
+      </w:r>
+      <w:r>
+        <w:t xml:space="preserve">runs unattended until it raises something.</w:t>
+      </w:r>
+    </w:p>
+    <w:p>
+      <w:pPr>
+        <w:pStyle w:val="Compact"/>
+        <w:numPr>
+          <w:ilvl w:val="0"/>
+          <w:numId w:val="1002"/>
+        </w:numPr>
+      </w:pPr>
+      <w:r>
+        <w:rPr>
+          <w:b/>
+          <w:bCs/>
+        </w:rPr>
+        <w:t xml:space="preserve">A release an adopter can verify without trusting your account of your own process</w:t>
+      </w:r>
+      <w:r>
+        <w:t xml:space="preserve">, and an</w:t>
+      </w:r>
+      <w:r>
+        <w:t xml:space="preserve"> </w:t>
+      </w:r>
+      <w:r>
+        <w:t xml:space="preserve">allowlist checked before the upload rather than after it, because the upload is the irreversible</w:t>
+      </w:r>
+      <w:r>
+        <w:t xml:space="preserve"> </w:t>
+      </w:r>
+      <w:r>
+        <w:t xml:space="preserve">step.</w:t>
+      </w:r>
+    </w:p>
+    <w:p>
+      <w:pPr>
+        <w:pStyle w:val="Compact"/>
+        <w:numPr>
+          <w:ilvl w:val="0"/>
+          <w:numId w:val="1002"/>
+        </w:numPr>
+      </w:pPr>
+      <w:r>
+        <w:rPr>
+          <w:b/>
+          <w:bCs/>
+        </w:rPr>
+        <w:t xml:space="preserve">A written split between what you own and what an adopter owns</w:t>
+      </w:r>
+      <w:r>
+        <w:t xml:space="preserve">, before you claim any control.</w:t>
+      </w:r>
+      <w:r>
+        <w:t xml:space="preserve"> </w:t>
+      </w:r>
+      <w:r>
+        <w:t xml:space="preserve">That gap is where a control ends up unowned by both sides, each assuming the other had it.</w:t>
+      </w:r>
+    </w:p>
+    <w:p>
+      <w:pPr>
+        <w:pStyle w:val="Compact"/>
+        <w:numPr>
+          <w:ilvl w:val="0"/>
+          <w:numId w:val="1002"/>
+        </w:numPr>
+      </w:pPr>
+      <w:r>
+        <w:rPr>
+          <w:b/>
+          <w:bCs/>
+        </w:rPr>
+        <w:t xml:space="preserve">A risk tier you can resolve in one question</w:t>
+      </w:r>
+      <w:r>
+        <w:t xml:space="preserve">, so a one-line fix does not carry the same</w:t>
+      </w:r>
+      <w:r>
+        <w:t xml:space="preserve"> </w:t>
+      </w:r>
+      <w:r>
+        <w:t xml:space="preserve">obligation as a change to an authorisation path, and so the cheap answer errs strict rather than</w:t>
+      </w:r>
+      <w:r>
+        <w:t xml:space="preserve"> </w:t>
+      </w:r>
+      <w:r>
+        <w:t xml:space="preserve">convenient.</w:t>
+      </w:r>
+    </w:p>
+    <w:p>
+      <w:pPr>
+        <w:pStyle w:val="Compact"/>
+        <w:numPr>
+          <w:ilvl w:val="0"/>
+          <w:numId w:val="1002"/>
+        </w:numPr>
+      </w:pPr>
+      <w:r>
+        <w:rPr>
+          <w:b/>
+          <w:bCs/>
+        </w:rPr>
+        <w:t xml:space="preserve">Wording you can actually publish.</w:t>
+      </w:r>
+      <w:r>
+        <w:t xml:space="preserve"> </w:t>
+      </w:r>
+      <w:r>
+        <w:t xml:space="preserve">Approved phrasings next to the overclaims they replace, and</w:t>
+      </w:r>
+      <w:r>
+        <w:t xml:space="preserve"> </w:t>
+      </w:r>
+      <w:r>
+        <w:t xml:space="preserve">a rule for saying what a gate does not prove -- which is what stops a document being rejected by</w:t>
+      </w:r>
+      <w:r>
+        <w:t xml:space="preserve"> </w:t>
+      </w:r>
+      <w:r>
+        <w:t xml:space="preserve">the first reader who checks its sources.</w:t>
+      </w:r>
+    </w:p>
+    <w:p>
+      <w:pPr>
+        <w:pStyle w:val="Compact"/>
+        <w:numPr>
+          <w:ilvl w:val="0"/>
+          <w:numId w:val="1002"/>
+        </w:numPr>
+      </w:pPr>
+      <w:r>
+        <w:rPr>
+          <w:b/>
+          <w:bCs/>
+        </w:rPr>
+        <w:t xml:space="preserve">The claims that failed verification, published next to the ones that survived.</w:t>
+      </w:r>
+      <w:r>
+        <w:t xml:space="preserve"> </w:t>
+      </w:r>
+      <w:r>
+        <w:t xml:space="preserve">Specific</w:t>
+      </w:r>
+      <w:r>
+        <w:t xml:space="preserve"> </w:t>
+      </w:r>
+      <w:r>
+        <w:t xml:space="preserve">numbers to stop repeating, including several that circulate widely and did not survive the filter.</w:t>
+      </w:r>
+    </w:p>
+    <w:bookmarkEnd w:id="24"/>
+    <w:bookmarkStart w:id="26" w:name="what-these-are-not"/>
+    <w:p>
+      <w:pPr>
+        <w:pStyle w:val="Heading2"/>
+      </w:pPr>
+      <w:r>
+        <w:t xml:space="preserve">What these are not</w:t>
+      </w:r>
+    </w:p>
+    <w:p>
+      <w:pPr>
+        <w:pStyle w:val="Compact"/>
+        <w:numPr>
+          <w:ilvl w:val="0"/>
+          <w:numId w:val="1003"/>
+        </w:numPr>
+      </w:pPr>
+      <w:r>
+        <w:rPr>
+          <w:b/>
+          <w:bCs/>
+        </w:rPr>
+        <w:t xml:space="preserve">No code ships with them.</w:t>
+      </w:r>
+      <w:r>
+        <w:t xml:space="preserve"> </w:t>
+      </w:r>
+      <w:r>
+        <w:t xml:space="preserve">These are rules and review procedures. Where one names a control, it</w:t>
+      </w:r>
+      <w:r>
+        <w:t xml:space="preserve"> </w:t>
+      </w:r>
+      <w:r>
+        <w:t xml:space="preserve">is describing something you would build, not something in this repository.</w:t>
+      </w:r>
+    </w:p>
+    <w:p>
+      <w:pPr>
+        <w:pStyle w:val="Compact"/>
+        <w:numPr>
+          <w:ilvl w:val="0"/>
+          <w:numId w:val="1003"/>
         </w:numPr>
       </w:pPr>
       <w:r>
@@ -874,7 +928,7 @@
         <w:pStyle w:val="Compact"/>
         <w:numPr>
           <w:ilvl w:val="0"/>
-          <w:numId w:val="1002"/>
+          <w:numId w:val="1003"/>
         </w:numPr>
       </w:pPr>
       <w:r>
@@ -908,7 +962,7 @@
         <w:pStyle w:val="Compact"/>
         <w:numPr>
           <w:ilvl w:val="0"/>
-          <w:numId w:val="1002"/>
+          <w:numId w:val="1003"/>
         </w:numPr>
       </w:pPr>
       <w:r>
@@ -1672,7 +1726,7 @@
         <w:pStyle w:val="Compact"/>
         <w:numPr>
           <w:ilvl w:val="0"/>
-          <w:numId w:val="1003"/>
+          <w:numId w:val="1004"/>
         </w:numPr>
       </w:pPr>
       <w:hyperlink r:id="rId9">
@@ -1709,7 +1763,7 @@
         <w:pStyle w:val="Compact"/>
         <w:numPr>
           <w:ilvl w:val="0"/>
-          <w:numId w:val="1003"/>
+          <w:numId w:val="1004"/>
         </w:numPr>
       </w:pPr>
       <w:hyperlink r:id="rId12">
@@ -1746,7 +1800,7 @@
         <w:pStyle w:val="Compact"/>
         <w:numPr>
           <w:ilvl w:val="0"/>
-          <w:numId w:val="1003"/>
+          <w:numId w:val="1004"/>
         </w:numPr>
       </w:pPr>
       <w:hyperlink r:id="rId15">
@@ -1777,7 +1831,7 @@
         <w:pStyle w:val="Compact"/>
         <w:numPr>
           <w:ilvl w:val="0"/>
-          <w:numId w:val="1003"/>
+          <w:numId w:val="1004"/>
         </w:numPr>
       </w:pPr>
       <w:hyperlink r:id="rId18">
@@ -1893,7 +1947,7 @@
         <w:pStyle w:val="Compact"/>
         <w:numPr>
           <w:ilvl w:val="0"/>
-          <w:numId w:val="1004"/>
+          <w:numId w:val="1005"/>
         </w:numPr>
       </w:pPr>
       <w:r>
@@ -1926,131 +1980,6 @@
       </w:r>
       <w:r>
         <w:t xml:space="preserve">several sections get shorter.</w:t>
-      </w:r>
-    </w:p>
-    <w:p>
-      <w:pPr>
-        <w:pStyle w:val="Compact"/>
-        <w:numPr>
-          <w:ilvl w:val="0"/>
-          <w:numId w:val="1004"/>
-        </w:numPr>
-      </w:pPr>
-      <w:r>
-        <w:rPr>
-          <w:b/>
-          <w:bCs/>
-        </w:rPr>
-        <w:t xml:space="preserve">A forge with a blocking pipeline, and a repository several sessions push to at once.</w:t>
-      </w:r>
-      <w:r>
-        <w:t xml:space="preserve"> </w:t>
-      </w:r>
-      <w:r>
-        <w:t xml:space="preserve">The</w:t>
-      </w:r>
-      <w:r>
-        <w:t xml:space="preserve"> </w:t>
-      </w:r>
-      <w:r>
-        <w:t xml:space="preserve">control placement advice assumes both. The failure shapes are not forge-specific; the field names</w:t>
-      </w:r>
-      <w:r>
-        <w:t xml:space="preserve"> </w:t>
-      </w:r>
-      <w:r>
-        <w:t xml:space="preserve">are.</w:t>
-      </w:r>
-    </w:p>
-    <w:p>
-      <w:pPr>
-        <w:pStyle w:val="Compact"/>
-        <w:numPr>
-          <w:ilvl w:val="0"/>
-          <w:numId w:val="1004"/>
-        </w:numPr>
-      </w:pPr>
-      <w:r>
-        <w:rPr>
-          <w:b/>
-          <w:bCs/>
-        </w:rPr>
-        <w:t xml:space="preserve">The domain is stripped on purpose.</w:t>
-      </w:r>
-      <w:r>
-        <w:t xml:space="preserve"> </w:t>
-      </w:r>
-      <w:r>
-        <w:t xml:space="preserve">These were written in a setting with regulated data and a</w:t>
-      </w:r>
-      <w:r>
-        <w:t xml:space="preserve"> </w:t>
-      </w:r>
-      <w:r>
-        <w:t xml:space="preserve">compliance regime, and the specifics of that setting are not here. Rules are expressed generically</w:t>
-      </w:r>
-      <w:r>
-        <w:t xml:space="preserve"> </w:t>
-      </w:r>
-      <w:r>
-        <w:t xml:space="preserve">-- "regulated data", "an untrusted inbound payload", "a compliance regime the adopting</w:t>
-      </w:r>
-      <w:r>
-        <w:t xml:space="preserve"> </w:t>
-      </w:r>
-      <w:r>
-        <w:t xml:space="preserve">organisation operates".</w:t>
-      </w:r>
-      <w:r>
-        <w:t xml:space="preserve"> </w:t>
-      </w:r>
-      <w:r>
-        <w:rPr>
-          <w:b/>
-          <w:bCs/>
-        </w:rPr>
-        <w:t xml:space="preserve">Where a rule could not be generalised it was dropped rather than</w:t>
-      </w:r>
-      <w:r>
-        <w:rPr>
-          <w:b/>
-          <w:bCs/>
-        </w:rPr>
-        <w:t xml:space="preserve"> </w:t>
-      </w:r>
-      <w:r>
-        <w:rPr>
-          <w:b/>
-          <w:bCs/>
-        </w:rPr>
-        <w:t xml:space="preserve">disguised</w:t>
-      </w:r>
-      <w:r>
-        <w:t xml:space="preserve">, so the set is not a complete account of the practice it came from.</w:t>
-      </w:r>
-    </w:p>
-    <w:bookmarkEnd w:id="30"/>
-    <w:bookmarkStart w:id="34" w:name="what-is-already-elsewhere-on-this-site"/>
-    <w:p>
-      <w:pPr>
-        <w:pStyle w:val="Heading2"/>
-      </w:pPr>
-      <w:r>
-        <w:t xml:space="preserve">What is already elsewhere on this site</w:t>
-      </w:r>
-    </w:p>
-    <w:p>
-      <w:pPr>
-        <w:pStyle w:val="FirstParagraph"/>
-      </w:pPr>
-      <w:r>
-        <w:t xml:space="preserve">The four documents link out rather than restate, and so should you when you adapt them. In</w:t>
-      </w:r>
-      <w:r>
-        <w:t xml:space="preserve"> </w:t>
-      </w:r>
-      <w:r>
-        <w:t xml:space="preserve">particular:</w:t>
       </w:r>
     </w:p>
     <w:p>
@@ -2059,6 +1988,131 @@
         <w:numPr>
           <w:ilvl w:val="0"/>
           <w:numId w:val="1005"/>
+        </w:numPr>
+      </w:pPr>
+      <w:r>
+        <w:rPr>
+          <w:b/>
+          <w:bCs/>
+        </w:rPr>
+        <w:t xml:space="preserve">A forge with a blocking pipeline, and a repository several sessions push to at once.</w:t>
+      </w:r>
+      <w:r>
+        <w:t xml:space="preserve"> </w:t>
+      </w:r>
+      <w:r>
+        <w:t xml:space="preserve">The</w:t>
+      </w:r>
+      <w:r>
+        <w:t xml:space="preserve"> </w:t>
+      </w:r>
+      <w:r>
+        <w:t xml:space="preserve">control placement advice assumes both. The failure shapes are not forge-specific; the field names</w:t>
+      </w:r>
+      <w:r>
+        <w:t xml:space="preserve"> </w:t>
+      </w:r>
+      <w:r>
+        <w:t xml:space="preserve">are.</w:t>
+      </w:r>
+    </w:p>
+    <w:p>
+      <w:pPr>
+        <w:pStyle w:val="Compact"/>
+        <w:numPr>
+          <w:ilvl w:val="0"/>
+          <w:numId w:val="1005"/>
+        </w:numPr>
+      </w:pPr>
+      <w:r>
+        <w:rPr>
+          <w:b/>
+          <w:bCs/>
+        </w:rPr>
+        <w:t xml:space="preserve">The domain is stripped on purpose.</w:t>
+      </w:r>
+      <w:r>
+        <w:t xml:space="preserve"> </w:t>
+      </w:r>
+      <w:r>
+        <w:t xml:space="preserve">These were written in a setting with regulated data and a</w:t>
+      </w:r>
+      <w:r>
+        <w:t xml:space="preserve"> </w:t>
+      </w:r>
+      <w:r>
+        <w:t xml:space="preserve">compliance regime, and the specifics of that setting are not here. Rules are expressed generically</w:t>
+      </w:r>
+      <w:r>
+        <w:t xml:space="preserve"> </w:t>
+      </w:r>
+      <w:r>
+        <w:t xml:space="preserve">-- "regulated data", "an untrusted inbound payload", "a compliance regime the adopting</w:t>
+      </w:r>
+      <w:r>
+        <w:t xml:space="preserve"> </w:t>
+      </w:r>
+      <w:r>
+        <w:t xml:space="preserve">organisation operates".</w:t>
+      </w:r>
+      <w:r>
+        <w:t xml:space="preserve"> </w:t>
+      </w:r>
+      <w:r>
+        <w:rPr>
+          <w:b/>
+          <w:bCs/>
+        </w:rPr>
+        <w:t xml:space="preserve">Where a rule could not be generalised it was dropped rather than</w:t>
+      </w:r>
+      <w:r>
+        <w:rPr>
+          <w:b/>
+          <w:bCs/>
+        </w:rPr>
+        <w:t xml:space="preserve"> </w:t>
+      </w:r>
+      <w:r>
+        <w:rPr>
+          <w:b/>
+          <w:bCs/>
+        </w:rPr>
+        <w:t xml:space="preserve">disguised</w:t>
+      </w:r>
+      <w:r>
+        <w:t xml:space="preserve">, so the set is not a complete account of the practice it came from.</w:t>
+      </w:r>
+    </w:p>
+    <w:bookmarkEnd w:id="30"/>
+    <w:bookmarkStart w:id="34" w:name="what-is-already-elsewhere-on-this-site"/>
+    <w:p>
+      <w:pPr>
+        <w:pStyle w:val="Heading2"/>
+      </w:pPr>
+      <w:r>
+        <w:t xml:space="preserve">What is already elsewhere on this site</w:t>
+      </w:r>
+    </w:p>
+    <w:p>
+      <w:pPr>
+        <w:pStyle w:val="FirstParagraph"/>
+      </w:pPr>
+      <w:r>
+        <w:t xml:space="preserve">The four documents link out rather than restate, and so should you when you adapt them. In</w:t>
+      </w:r>
+      <w:r>
+        <w:t xml:space="preserve"> </w:t>
+      </w:r>
+      <w:r>
+        <w:t xml:space="preserve">particular:</w:t>
+      </w:r>
+    </w:p>
+    <w:p>
+      <w:pPr>
+        <w:pStyle w:val="Compact"/>
+        <w:numPr>
+          <w:ilvl w:val="0"/>
+          <w:numId w:val="1006"/>
         </w:numPr>
       </w:pPr>
       <w:hyperlink r:id="rId25">
@@ -2093,7 +2147,7 @@
         <w:pStyle w:val="Compact"/>
         <w:numPr>
           <w:ilvl w:val="0"/>
-          <w:numId w:val="1005"/>
+          <w:numId w:val="1006"/>
         </w:numPr>
       </w:pPr>
       <w:hyperlink r:id="rId31">
@@ -2122,7 +2176,7 @@
         <w:pStyle w:val="Compact"/>
         <w:numPr>
           <w:ilvl w:val="0"/>
-          <w:numId w:val="1005"/>
+          <w:numId w:val="1006"/>
         </w:numPr>
       </w:pPr>
       <w:hyperlink r:id="rId32">
@@ -2157,7 +2211,7 @@
         <w:pStyle w:val="Compact"/>
         <w:numPr>
           <w:ilvl w:val="0"/>
-          <w:numId w:val="1005"/>
+          <w:numId w:val="1006"/>
         </w:numPr>
       </w:pPr>
       <w:hyperlink r:id="rId33">
@@ -2491,6 +2545,9 @@
     <w:abstractNumId w:val="991"/>
   </w:num>
   <w:num w:numId="1003">
+    <w:abstractNumId w:val="991"/>
+  </w:num>
+  <w:num w:numId="1004">
     <w:abstractNumId w:val="99411"/>
     <w:lvlOverride w:ilvl="0">
       <w:startOverride w:val="1"/>
@@ -2520,10 +2577,10 @@
       <w:startOverride w:val="1"/>
     </w:lvlOverride>
   </w:num>
-  <w:num w:numId="1004">
+  <w:num w:numId="1005">
     <w:abstractNumId w:val="991"/>
   </w:num>
-  <w:num w:numId="1005">
+  <w:num w:numId="1006">
     <w:abstractNumId w:val="991"/>
   </w:num>
 </w:numbering>

</xml_diff>

<commit_message>
docs(standards): say why the two formats trade off, not just that they differ
The format guidance said what each file is and left the reader to infer why they
would want one. The actual trade runs in opposite directions, and naming it is
what makes the choice obvious: markdown is harder on a human eye -- syntax
showing, tables unaligned -- and easier for an AI, because plain text is what an
agent reads best. Word is the reverse: comfortable to read and mark up, and of no
use to an agent.

That also explains the recommendation immediately below it, where the four
documents are handed to an agent rather than read.

OVERVIEW.docx regenerated. Verified: check-ascii clean, 35 tests pass.
</commit_message>
<xml_diff>
--- a/docs/standards/word/OVERVIEW.docx
+++ b/docs/standards/word/OVERVIEW.docx
@@ -705,19 +705,37 @@
         <w:pStyle w:val="BodyText"/>
       </w:pPr>
       <w:r>
-        <w:t xml:space="preserve">Markdown is plain text. It drops into a repository, and it diffs cleanly as you edit it -- which you</w:t>
-      </w:r>
-      <w:r>
-        <w:t xml:space="preserve"> </w:t>
-      </w:r>
-      <w:r>
-        <w:t xml:space="preserve">will, because none of these are usable as they stand. The Word files hold the same content,</w:t>
-      </w:r>
-      <w:r>
-        <w:t xml:space="preserve"> </w:t>
-      </w:r>
-      <w:r>
-        <w:t xml:space="preserve">generated from the same markdown. Take those for people who will read or mark up rather than adopt.</w:t>
+        <w:t xml:space="preserve">The two formats trade off in opposite directions. Markdown is plain text: harder on a human eye,</w:t>
+      </w:r>
+      <w:r>
+        <w:t xml:space="preserve"> </w:t>
+      </w:r>
+      <w:r>
+        <w:t xml:space="preserve">with its syntax showing and its tables unaligned, and easier for an AI to work with, because that</w:t>
+      </w:r>
+      <w:r>
+        <w:t xml:space="preserve"> </w:t>
+      </w:r>
+      <w:r>
+        <w:t xml:space="preserve">same plain text is exactly what an agent reads best. It also drops into a repository and diffs</w:t>
+      </w:r>
+      <w:r>
+        <w:t xml:space="preserve"> </w:t>
+      </w:r>
+      <w:r>
+        <w:t xml:space="preserve">cleanly as you edit it -- which you will, because none of these are usable as they stand. Word is</w:t>
+      </w:r>
+      <w:r>
+        <w:t xml:space="preserve"> </w:t>
+      </w:r>
+      <w:r>
+        <w:t xml:space="preserve">the reverse: comfortable to read, easy to circulate and mark up, and of no use to an agent. The Word</w:t>
+      </w:r>
+      <w:r>
+        <w:t xml:space="preserve"> </w:t>
+      </w:r>
+      <w:r>
+        <w:t xml:space="preserve">files hold the same content, generated from the same markdown.</w:t>
       </w:r>
     </w:p>
     <w:p>

</xml_diff>

<commit_message>
docs(standards): the review-depth link is now 'Human review of code'
"Review depth" describes the mechanism the document uses. "Human review of
code" describes what the reader is looking for, which is what a link has to do.
Changed in the sidebar, the download table, the buys-you table, the reading
order, and the CISO summary's next-steps table.

The filename and URL stay REVIEW-DEPTH -- the page is an hour old and only the
nav pointed at it, but there is no reason to spend a URL change on a label
change, and the two do not have to match.

OVERVIEW.docx and CISO-SUMMARY.docx regenerated. Verified: check-ascii clean, 35
tests pass.
</commit_message>
<xml_diff>
--- a/docs/standards/word/OVERVIEW.docx
+++ b/docs/standards/word/OVERVIEW.docx
@@ -452,13 +452,13 @@
                 <w:b/>
                 <w:bCs/>
               </w:rPr>
-              <w:t xml:space="preserve">Review depth</w:t>
+              <w:t xml:space="preserve">Human review of code</w:t>
             </w:r>
             <w:r>
               <w:t xml:space="preserve"> </w:t>
             </w:r>
             <w:r>
-              <w:t xml:space="preserve">-- how much a human must read</w:t>
+              <w:t xml:space="preserve">-- how much of it a human must read</w:t>
             </w:r>
           </w:p>
         </w:tc>
@@ -1487,7 +1487,7 @@
                 <w:rPr>
                   <w:rStyle w:val="Hyperlink"/>
                 </w:rPr>
-                <w:t xml:space="preserve">Review depth</w:t>
+                <w:t xml:space="preserve">Human review of code</w:t>
               </w:r>
             </w:hyperlink>
           </w:p>
@@ -2197,7 +2197,7 @@
             <w:b/>
             <w:bCs/>
           </w:rPr>
-          <w:t xml:space="preserve">Review depth</w:t>
+          <w:t xml:space="preserve">Human review of code</w:t>
         </w:r>
       </w:hyperlink>
       <w:r>

</xml_diff>

<commit_message>
docs(standards): the CISO-summary line was two ideas in one sentence
"for a security executive who has to decide whether any of it is being done,
rather than adopt it" made a reader carry three things at once: who the document
is for, what that person's job is, and a contrast with a job they do not have.
"It" also did double duty, standing for the practices and then for the summary.

Split into two sentences, with the contrast stated as the question the document
answers: "Plus a two-page summary for a security executive. It answers a
different question: not how to adopt any of this, but how to tell whether your
teams already do it."

Also closed an appositive an earlier pass left open in the bullet above it --
"Claude Code, or another AI-assisted coding tool, when it writes much of it".

OVERVIEW.docx regenerated. Verified: check-ascii clean, 35 tests pass.
</commit_message>
<xml_diff>
--- a/docs/standards/word/OVERVIEW.docx
+++ b/docs/standards/word/OVERVIEW.docx
@@ -90,7 +90,7 @@
         </w:numPr>
       </w:pPr>
       <w:r>
-        <w:t xml:space="preserve">how to govern Claude Code, or another AI-assisted coding tool when it writes much of it</w:t>
+        <w:t xml:space="preserve">how to govern Claude Code, or another AI-assisted coding tool, when it writes much of it</w:t>
       </w:r>
     </w:p>
     <w:p>
@@ -127,13 +127,13 @@
         <w:t xml:space="preserve"> </w:t>
       </w:r>
       <w:r>
-        <w:t xml:space="preserve">for a security executive who has to decide whether any of</w:t>
-      </w:r>
-      <w:r>
-        <w:t xml:space="preserve"> </w:t>
-      </w:r>
-      <w:r>
-        <w:t xml:space="preserve">it is being done, rather than adopt it.</w:t>
+        <w:t xml:space="preserve">for a security executive. It answers a different</w:t>
+      </w:r>
+      <w:r>
+        <w:t xml:space="preserve"> </w:t>
+      </w:r>
+      <w:r>
+        <w:t xml:space="preserve">question: not how to adopt any of this, but how to tell whether your teams already do it.</w:t>
       </w:r>
     </w:p>
     <w:p>

</xml_diff>

<commit_message>
docs(standards): say what a CLAUDE.md file is before offering a template for one
"A working agreement that adopts them" assumed the reader knows what CLAUDE.md
is. Somebody arriving at the standards from a CISO summary has no reason to.

The table row now says it: CLAUDE.md is the file Claude Code reads at the start
of every session, which is what makes it the place a project's standing rules
live, and this is a starting point for one. The paragraph below the table opens
with the same fact rather than referring to "the working agreement template" as
though it were already established.

The landing page already explained it at the install step, so it is unchanged --
the gap was only on the page reached directly from a summary or a search result.

OVERVIEW.docx regenerated. Verified: check-ascii clean over 91 files, 35 tests
pass.
</commit_message>
<xml_diff>
--- a/docs/standards/word/OVERVIEW.docx
+++ b/docs/standards/word/OVERVIEW.docx
@@ -705,7 +705,61 @@
               <w:pStyle w:val="Compact"/>
             </w:pPr>
             <w:r>
-              <w:t xml:space="preserve">A working agreement that adopts them</w:t>
+              <w:rPr>
+                <w:b/>
+                <w:bCs/>
+              </w:rPr>
+              <w:t xml:space="preserve">A</w:t>
+            </w:r>
+            <w:r>
+              <w:rPr>
+                <w:b/>
+                <w:bCs/>
+              </w:rPr>
+              <w:t xml:space="preserve"> </w:t>
+            </w:r>
+            <w:r>
+              <w:rPr>
+                <w:rStyle w:val="VerbatimChar"/>
+                <w:b/>
+                <w:bCs/>
+              </w:rPr>
+              <w:t xml:space="preserve">CLAUDE.md</w:t>
+            </w:r>
+            <w:r>
+              <w:rPr>
+                <w:b/>
+                <w:bCs/>
+              </w:rPr>
+              <w:t xml:space="preserve"> </w:t>
+            </w:r>
+            <w:r>
+              <w:rPr>
+                <w:b/>
+                <w:bCs/>
+              </w:rPr>
+              <w:t xml:space="preserve">template</w:t>
+            </w:r>
+            <w:r>
+              <w:t xml:space="preserve"> </w:t>
+            </w:r>
+            <w:r>
+              <w:t xml:space="preserve">--</w:t>
+            </w:r>
+            <w:r>
+              <w:t xml:space="preserve"> </w:t>
+            </w:r>
+            <w:r>
+              <w:rPr>
+                <w:rStyle w:val="VerbatimChar"/>
+              </w:rPr>
+              <w:t xml:space="preserve">CLAUDE.md</w:t>
+            </w:r>
+            <w:r>
+              <w:t xml:space="preserve"> </w:t>
+            </w:r>
+            <w:r>
+              <w:t xml:space="preserve">is the file Claude Code reads at the start of every session, so it is where a project's standing rules live. This one is a starting point.</w:t>
             </w:r>
           </w:p>
         </w:tc>
@@ -934,7 +988,28 @@
         <w:t xml:space="preserve"> </w:t>
       </w:r>
       <w:r>
-        <w:t xml:space="preserve">The</w:t>
+        <w:t xml:space="preserve">Claude Code reads a file called</w:t>
+      </w:r>
+      <w:r>
+        <w:t xml:space="preserve"> </w:t>
+      </w:r>
+      <w:r>
+        <w:rPr>
+          <w:rStyle w:val="VerbatimChar"/>
+        </w:rPr>
+        <w:t xml:space="preserve">CLAUDE.md</w:t>
+      </w:r>
+      <w:r>
+        <w:t xml:space="preserve"> </w:t>
+      </w:r>
+      <w:r>
+        <w:t xml:space="preserve">at the</w:t>
+      </w:r>
+      <w:r>
+        <w:t xml:space="preserve"> </w:t>
+      </w:r>
+      <w:r>
+        <w:t xml:space="preserve">start of every session, which makes it the place a project keeps its standing rules. The</w:t>
       </w:r>
       <w:r>
         <w:t xml:space="preserve"> </w:t>
@@ -944,20 +1019,26 @@
           <w:rPr>
             <w:rStyle w:val="Hyperlink"/>
           </w:rPr>
-          <w:t xml:space="preserve">working agreement template</w:t>
+          <w:t xml:space="preserve">template above</w:t>
         </w:r>
       </w:hyperlink>
       <w:r>
         <w:t xml:space="preserve"> </w:t>
       </w:r>
       <w:r>
-        <w:t xml:space="preserve">carries a table for exactly that: which of these controls exist here, and when each was last proven</w:t>
-      </w:r>
-      <w:r>
-        <w:t xml:space="preserve"> </w:t>
-      </w:r>
-      <w:r>
-        <w:t xml:space="preserve">able to fail. A standard that no working agreement references is a document, not a practice.</w:t>
+        <w:t xml:space="preserve">carries a table for</w:t>
+      </w:r>
+      <w:r>
+        <w:t xml:space="preserve"> </w:t>
+      </w:r>
+      <w:r>
+        <w:t xml:space="preserve">exactly that: which of these controls exist here, and when each was last proven able to fail. A</w:t>
+      </w:r>
+      <w:r>
+        <w:t xml:space="preserve"> </w:t>
+      </w:r>
+      <w:r>
+        <w:t xml:space="preserve">standard that no such file references is a document, not a practice.</w:t>
       </w:r>
     </w:p>
     <w:p>

</xml_diff>

<commit_message>
docs(standards): drop the bulk-fetch section
Removed at the owner's request. It offered two shell snippets to pull the whole
set at once, and the per-file links in 'The files' at the top already do that job
for anyone who wants a copy.

It had also gone out of date quietly: the security-standard assessment lives in
docs/ rather than docs/standards/, so neither loop included it, and a section
promising the whole set was delivering six of seven.

Nothing linked to the section, so no anchor moved. The closing line about not
carrying over claims these documents decline to make went with it -- 'What these
are not' above states that in full.

OVERVIEW.docx regenerated. Verified: check-ascii clean, 35 tests pass.
</commit_message>
<xml_diff>
--- a/docs/standards/word/OVERVIEW.docx
+++ b/docs/standards/word/OVERVIEW.docx
@@ -28,7 +28,7 @@
         </w:p>
       </w:sdtContent>
     </w:sdt>
-    <w:bookmarkStart w:id="44" w:name="standards-you-can-start-from"/>
+    <w:bookmarkStart w:id="43" w:name="standards-you-can-start-from"/>
     <w:p>
       <w:pPr>
         <w:pStyle w:val="Heading1"/>
@@ -1820,579 +1820,7 @@
       </w:tr>
     </w:tbl>
     <w:bookmarkEnd w:id="37"/>
-    <w:bookmarkStart w:id="38" w:name="fetch-the-whole-set-in-one-command"/>
-    <w:p>
-      <w:pPr>
-        <w:pStyle w:val="Heading2"/>
-      </w:pPr>
-      <w:r>
-        <w:t xml:space="preserve">Fetch the whole set in one command</w:t>
-      </w:r>
-    </w:p>
-    <w:p>
-      <w:pPr>
-        <w:pStyle w:val="FirstParagraph"/>
-      </w:pPr>
-      <w:r>
-        <w:t xml:space="preserve">Individual links are in</w:t>
-      </w:r>
-      <w:r>
-        <w:t xml:space="preserve"> </w:t>
-      </w:r>
-      <w:hyperlink w:anchor="the-files">
-        <w:r>
-          <w:rPr>
-            <w:rStyle w:val="Hyperlink"/>
-          </w:rPr>
-          <w:t xml:space="preserve">The files</w:t>
-        </w:r>
-      </w:hyperlink>
-      <w:r>
-        <w:t xml:space="preserve"> </w:t>
-      </w:r>
-      <w:r>
-        <w:t xml:space="preserve">at the top. This section is</w:t>
-      </w:r>
-      <w:r>
-        <w:t xml:space="preserve"> </w:t>
-      </w:r>
-      <w:r>
-        <w:t xml:space="preserve">only for pulling all of them at once, into a</w:t>
-      </w:r>
-      <w:r>
-        <w:t xml:space="preserve"> </w:t>
-      </w:r>
-      <w:r>
-        <w:rPr>
-          <w:rStyle w:val="VerbatimChar"/>
-        </w:rPr>
-        <w:t xml:space="preserve">standards/</w:t>
-      </w:r>
-      <w:r>
-        <w:t xml:space="preserve"> </w:t>
-      </w:r>
-      <w:r>
-        <w:t xml:space="preserve">directory below wherever you run it:</w:t>
-      </w:r>
-    </w:p>
-    <w:p>
-      <w:pPr>
-        <w:pStyle w:val="SourceCode"/>
-      </w:pPr>
-      <w:r>
-        <w:rPr>
-          <w:rStyle w:val="ControlFlowTok"/>
-        </w:rPr>
-        <w:t xml:space="preserve">for</w:t>
-      </w:r>
-      <w:r>
-        <w:rPr>
-          <w:rStyle w:val="NormalTok"/>
-        </w:rPr>
-        <w:t xml:space="preserve"> f </w:t>
-      </w:r>
-      <w:r>
-        <w:rPr>
-          <w:rStyle w:val="KeywordTok"/>
-        </w:rPr>
-        <w:t xml:space="preserve">in</w:t>
-      </w:r>
-      <w:r>
-        <w:rPr>
-          <w:rStyle w:val="NormalTok"/>
-        </w:rPr>
-        <w:t xml:space="preserve"> OVERVIEW CISO-SUMMARY REVIEW-DEPTH CODE-QUALITY SECURE-DEVELOPMENT AI-ASSISTED-DEVELOPMENT DEPENDENCY-INTEGRITY</w:t>
-      </w:r>
-      <w:r>
-        <w:rPr>
-          <w:rStyle w:val="KeywordTok"/>
-        </w:rPr>
-        <w:t xml:space="preserve">;</w:t>
-      </w:r>
-      <w:r>
-        <w:rPr>
-          <w:rStyle w:val="NormalTok"/>
-        </w:rPr>
-        <w:t xml:space="preserve"> </w:t>
-      </w:r>
-      <w:r>
-        <w:rPr>
-          <w:rStyle w:val="ControlFlowTok"/>
-        </w:rPr>
-        <w:t xml:space="preserve">do</w:t>
-      </w:r>
-      <w:r>
-        <w:br/>
-      </w:r>
-      <w:r>
-        <w:rPr>
-          <w:rStyle w:val="NormalTok"/>
-        </w:rPr>
-        <w:t xml:space="preserve">  </w:t>
-      </w:r>
-      <w:r>
-        <w:rPr>
-          <w:rStyle w:val="ExtensionTok"/>
-        </w:rPr>
-        <w:t xml:space="preserve">curl</w:t>
-      </w:r>
-      <w:r>
-        <w:rPr>
-          <w:rStyle w:val="NormalTok"/>
-        </w:rPr>
-        <w:t xml:space="preserve"> </w:t>
-      </w:r>
-      <w:r>
-        <w:rPr>
-          <w:rStyle w:val="AttributeTok"/>
-        </w:rPr>
-        <w:t xml:space="preserve">-fsSL</w:t>
-      </w:r>
-      <w:r>
-        <w:rPr>
-          <w:rStyle w:val="NormalTok"/>
-        </w:rPr>
-        <w:t xml:space="preserve"> </w:t>
-      </w:r>
-      <w:r>
-        <w:rPr>
-          <w:rStyle w:val="AttributeTok"/>
-        </w:rPr>
-        <w:t xml:space="preserve">--create-dirs</w:t>
-      </w:r>
-      <w:r>
-        <w:rPr>
-          <w:rStyle w:val="NormalTok"/>
-        </w:rPr>
-        <w:t xml:space="preserve"> </w:t>
-      </w:r>
-      <w:r>
-        <w:rPr>
-          <w:rStyle w:val="AttributeTok"/>
-        </w:rPr>
-        <w:t xml:space="preserve">-o</w:t>
-      </w:r>
-      <w:r>
-        <w:rPr>
-          <w:rStyle w:val="NormalTok"/>
-        </w:rPr>
-        <w:t xml:space="preserve"> </w:t>
-      </w:r>
-      <w:r>
-        <w:rPr>
-          <w:rStyle w:val="StringTok"/>
-        </w:rPr>
-        <w:t xml:space="preserve">"standards/</w:t>
-      </w:r>
-      <w:r>
-        <w:rPr>
-          <w:rStyle w:val="VariableTok"/>
-        </w:rPr>
-        <w:t xml:space="preserve">$f</w:t>
-      </w:r>
-      <w:r>
-        <w:rPr>
-          <w:rStyle w:val="StringTok"/>
-        </w:rPr>
-        <w:t xml:space="preserve">.md"</w:t>
-      </w:r>
-      <w:r>
-        <w:rPr>
-          <w:rStyle w:val="NormalTok"/>
-        </w:rPr>
-        <w:t xml:space="preserve"> </w:t>
-      </w:r>
-      <w:r>
-        <w:rPr>
-          <w:rStyle w:val="DataTypeTok"/>
-        </w:rPr>
-        <w:t xml:space="preserve">\</w:t>
-      </w:r>
-      <w:r>
-        <w:br/>
-      </w:r>
-      <w:r>
-        <w:rPr>
-          <w:rStyle w:val="NormalTok"/>
-        </w:rPr>
-        <w:t xml:space="preserve">    </w:t>
-      </w:r>
-      <w:r>
-        <w:rPr>
-          <w:rStyle w:val="StringTok"/>
-        </w:rPr>
-        <w:t xml:space="preserve">"https://raw.githubusercontent.com/wshallwshall/claude-multisession/main/docs/standards/</w:t>
-      </w:r>
-      <w:r>
-        <w:rPr>
-          <w:rStyle w:val="VariableTok"/>
-        </w:rPr>
-        <w:t xml:space="preserve">$f</w:t>
-      </w:r>
-      <w:r>
-        <w:rPr>
-          <w:rStyle w:val="StringTok"/>
-        </w:rPr>
-        <w:t xml:space="preserve">.md"</w:t>
-      </w:r>
-      <w:r>
-        <w:br/>
-      </w:r>
-      <w:r>
-        <w:rPr>
-          <w:rStyle w:val="ControlFlowTok"/>
-        </w:rPr>
-        <w:t xml:space="preserve">done</w:t>
-      </w:r>
-    </w:p>
-    <w:p>
-      <w:pPr>
-        <w:pStyle w:val="SourceCode"/>
-      </w:pPr>
-      <w:r>
-        <w:rPr>
-          <w:rStyle w:val="VariableTok"/>
-        </w:rPr>
-        <w:t xml:space="preserve">$base</w:t>
-      </w:r>
-      <w:r>
-        <w:rPr>
-          <w:rStyle w:val="NormalTok"/>
-        </w:rPr>
-        <w:t xml:space="preserve"> </w:t>
-      </w:r>
-      <w:r>
-        <w:rPr>
-          <w:rStyle w:val="OperatorTok"/>
-        </w:rPr>
-        <w:t xml:space="preserve">=</w:t>
-      </w:r>
-      <w:r>
-        <w:rPr>
-          <w:rStyle w:val="NormalTok"/>
-        </w:rPr>
-        <w:t xml:space="preserve"> </w:t>
-      </w:r>
-      <w:r>
-        <w:rPr>
-          <w:rStyle w:val="StringTok"/>
-        </w:rPr>
-        <w:t xml:space="preserve">'https://raw.githubusercontent.com/wshallwshall/claude-multisession/main/docs/standards'</w:t>
-      </w:r>
-      <w:r>
-        <w:br/>
-      </w:r>
-      <w:r>
-        <w:rPr>
-          <w:rStyle w:val="FunctionTok"/>
-        </w:rPr>
-        <w:t xml:space="preserve">New-Item</w:t>
-      </w:r>
-      <w:r>
-        <w:rPr>
-          <w:rStyle w:val="NormalTok"/>
-        </w:rPr>
-        <w:t xml:space="preserve"> </w:t>
-      </w:r>
-      <w:r>
-        <w:rPr>
-          <w:rStyle w:val="OperatorTok"/>
-        </w:rPr>
-        <w:t xml:space="preserve">-</w:t>
-      </w:r>
-      <w:r>
-        <w:rPr>
-          <w:rStyle w:val="NormalTok"/>
-        </w:rPr>
-        <w:t xml:space="preserve">ItemType Directory </w:t>
-      </w:r>
-      <w:r>
-        <w:rPr>
-          <w:rStyle w:val="OperatorTok"/>
-        </w:rPr>
-        <w:t xml:space="preserve">-</w:t>
-      </w:r>
-      <w:r>
-        <w:rPr>
-          <w:rStyle w:val="NormalTok"/>
-        </w:rPr>
-        <w:t xml:space="preserve">Force standards </w:t>
-      </w:r>
-      <w:r>
-        <w:rPr>
-          <w:rStyle w:val="OperatorTok"/>
-        </w:rPr>
-        <w:t xml:space="preserve">|</w:t>
-      </w:r>
-      <w:r>
-        <w:rPr>
-          <w:rStyle w:val="NormalTok"/>
-        </w:rPr>
-        <w:t xml:space="preserve"> </w:t>
-      </w:r>
-      <w:r>
-        <w:rPr>
-          <w:rStyle w:val="FunctionTok"/>
-        </w:rPr>
-        <w:t xml:space="preserve">Out-Null</w:t>
-      </w:r>
-      <w:r>
-        <w:br/>
-      </w:r>
-      <w:r>
-        <w:rPr>
-          <w:rStyle w:val="StringTok"/>
-        </w:rPr>
-        <w:t xml:space="preserve">'OVERVIEW'</w:t>
-      </w:r>
-      <w:r>
-        <w:rPr>
-          <w:rStyle w:val="OperatorTok"/>
-        </w:rPr>
-        <w:t xml:space="preserve">,</w:t>
-      </w:r>
-      <w:r>
-        <w:rPr>
-          <w:rStyle w:val="StringTok"/>
-        </w:rPr>
-        <w:t xml:space="preserve">'CISO-SUMMARY'</w:t>
-      </w:r>
-      <w:r>
-        <w:rPr>
-          <w:rStyle w:val="OperatorTok"/>
-        </w:rPr>
-        <w:t xml:space="preserve">,</w:t>
-      </w:r>
-      <w:r>
-        <w:rPr>
-          <w:rStyle w:val="StringTok"/>
-        </w:rPr>
-        <w:t xml:space="preserve">'REVIEW-DEPTH'</w:t>
-      </w:r>
-      <w:r>
-        <w:rPr>
-          <w:rStyle w:val="OperatorTok"/>
-        </w:rPr>
-        <w:t xml:space="preserve">,</w:t>
-      </w:r>
-      <w:r>
-        <w:rPr>
-          <w:rStyle w:val="StringTok"/>
-        </w:rPr>
-        <w:t xml:space="preserve">'CODE-QUALITY'</w:t>
-      </w:r>
-      <w:r>
-        <w:rPr>
-          <w:rStyle w:val="OperatorTok"/>
-        </w:rPr>
-        <w:t xml:space="preserve">,</w:t>
-      </w:r>
-      <w:r>
-        <w:rPr>
-          <w:rStyle w:val="StringTok"/>
-        </w:rPr>
-        <w:t xml:space="preserve">'SECURE-DEVELOPMENT'</w:t>
-      </w:r>
-      <w:r>
-        <w:rPr>
-          <w:rStyle w:val="OperatorTok"/>
-        </w:rPr>
-        <w:t xml:space="preserve">,</w:t>
-      </w:r>
-      <w:r>
-        <w:rPr>
-          <w:rStyle w:val="StringTok"/>
-        </w:rPr>
-        <w:t xml:space="preserve">'AI-ASSISTED-DEVELOPMENT'</w:t>
-      </w:r>
-      <w:r>
-        <w:rPr>
-          <w:rStyle w:val="OperatorTok"/>
-        </w:rPr>
-        <w:t xml:space="preserve">,</w:t>
-      </w:r>
-      <w:r>
-        <w:rPr>
-          <w:rStyle w:val="StringTok"/>
-        </w:rPr>
-        <w:t xml:space="preserve">'DEPENDENCY-INTEGRITY'</w:t>
-      </w:r>
-      <w:r>
-        <w:rPr>
-          <w:rStyle w:val="NormalTok"/>
-        </w:rPr>
-        <w:t xml:space="preserve"> </w:t>
-      </w:r>
-      <w:r>
-        <w:rPr>
-          <w:rStyle w:val="OperatorTok"/>
-        </w:rPr>
-        <w:t xml:space="preserve">|</w:t>
-      </w:r>
-      <w:r>
-        <w:br/>
-      </w:r>
-      <w:r>
-        <w:rPr>
-          <w:rStyle w:val="NormalTok"/>
-        </w:rPr>
-        <w:t xml:space="preserve">  </w:t>
-      </w:r>
-      <w:r>
-        <w:rPr>
-          <w:rStyle w:val="FunctionTok"/>
-        </w:rPr>
-        <w:t xml:space="preserve">ForEach-Object</w:t>
-      </w:r>
-      <w:r>
-        <w:rPr>
-          <w:rStyle w:val="NormalTok"/>
-        </w:rPr>
-        <w:t xml:space="preserve"> </w:t>
-      </w:r>
-      <w:r>
-        <w:rPr>
-          <w:rStyle w:val="OperatorTok"/>
-        </w:rPr>
-        <w:t xml:space="preserve">{</w:t>
-      </w:r>
-      <w:r>
-        <w:rPr>
-          <w:rStyle w:val="NormalTok"/>
-        </w:rPr>
-        <w:t xml:space="preserve"> </w:t>
-      </w:r>
-      <w:r>
-        <w:rPr>
-          <w:rStyle w:val="FunctionTok"/>
-        </w:rPr>
-        <w:t xml:space="preserve">Invoke-WebRequest</w:t>
-      </w:r>
-      <w:r>
-        <w:rPr>
-          <w:rStyle w:val="NormalTok"/>
-        </w:rPr>
-        <w:t xml:space="preserve"> </w:t>
-      </w:r>
-      <w:r>
-        <w:rPr>
-          <w:rStyle w:val="StringTok"/>
-        </w:rPr>
-        <w:t xml:space="preserve">"</w:t>
-      </w:r>
-      <w:r>
-        <w:rPr>
-          <w:rStyle w:val="VariableTok"/>
-        </w:rPr>
-        <w:t xml:space="preserve">$base</w:t>
-      </w:r>
-      <w:r>
-        <w:rPr>
-          <w:rStyle w:val="StringTok"/>
-        </w:rPr>
-        <w:t xml:space="preserve">/</w:t>
-      </w:r>
-      <w:r>
-        <w:rPr>
-          <w:rStyle w:val="VariableTok"/>
-        </w:rPr>
-        <w:t xml:space="preserve">$_</w:t>
-      </w:r>
-      <w:r>
-        <w:rPr>
-          <w:rStyle w:val="StringTok"/>
-        </w:rPr>
-        <w:t xml:space="preserve">.md"</w:t>
-      </w:r>
-      <w:r>
-        <w:rPr>
-          <w:rStyle w:val="NormalTok"/>
-        </w:rPr>
-        <w:t xml:space="preserve"> </w:t>
-      </w:r>
-      <w:r>
-        <w:rPr>
-          <w:rStyle w:val="OperatorTok"/>
-        </w:rPr>
-        <w:t xml:space="preserve">-</w:t>
-      </w:r>
-      <w:r>
-        <w:rPr>
-          <w:rStyle w:val="NormalTok"/>
-        </w:rPr>
-        <w:t xml:space="preserve">OutFile </w:t>
-      </w:r>
-      <w:r>
-        <w:rPr>
-          <w:rStyle w:val="StringTok"/>
-        </w:rPr>
-        <w:t xml:space="preserve">"standards/</w:t>
-      </w:r>
-      <w:r>
-        <w:rPr>
-          <w:rStyle w:val="VariableTok"/>
-        </w:rPr>
-        <w:t xml:space="preserve">$_</w:t>
-      </w:r>
-      <w:r>
-        <w:rPr>
-          <w:rStyle w:val="StringTok"/>
-        </w:rPr>
-        <w:t xml:space="preserve">.md"</w:t>
-      </w:r>
-      <w:r>
-        <w:rPr>
-          <w:rStyle w:val="NormalTok"/>
-        </w:rPr>
-        <w:t xml:space="preserve"> </w:t>
-      </w:r>
-      <w:r>
-        <w:rPr>
-          <w:rStyle w:val="OperatorTok"/>
-        </w:rPr>
-        <w:t xml:space="preserve">}</w:t>
-      </w:r>
-    </w:p>
-    <w:p>
-      <w:pPr>
-        <w:pStyle w:val="FirstParagraph"/>
-      </w:pPr>
-      <w:r>
-        <w:t xml:space="preserve">The one thing not to carry over is a claim these documents decline to make -- see</w:t>
-      </w:r>
-      <w:r>
-        <w:t xml:space="preserve"> </w:t>
-      </w:r>
-      <w:r>
-        <w:rPr>
-          <w:i/>
-          <w:iCs/>
-        </w:rPr>
-        <w:t xml:space="preserve">What these are</w:t>
-      </w:r>
-      <w:r>
-        <w:rPr>
-          <w:i/>
-          <w:iCs/>
-        </w:rPr>
-        <w:t xml:space="preserve"> </w:t>
-      </w:r>
-      <w:r>
-        <w:rPr>
-          <w:i/>
-          <w:iCs/>
-        </w:rPr>
-        <w:t xml:space="preserve">not</w:t>
-      </w:r>
-      <w:r>
-        <w:t xml:space="preserve"> </w:t>
-      </w:r>
-      <w:r>
-        <w:t xml:space="preserve">above, and keep your edits honest about which controls you have actually built.</w:t>
-      </w:r>
-    </w:p>
-    <w:bookmarkEnd w:id="38"/>
-    <w:bookmarkStart w:id="39" w:name="the-order-to-read-them-in"/>
+    <w:bookmarkStart w:id="38" w:name="the-order-to-read-them-in"/>
     <w:p>
       <w:pPr>
         <w:pStyle w:val="Heading2"/>
@@ -2588,8 +2016,8 @@
         <w:t xml:space="preserve">tells you whether the rest applies to you, and it is deliberately placed before the rules.</w:t>
       </w:r>
     </w:p>
-    <w:bookmarkEnd w:id="39"/>
-    <w:bookmarkStart w:id="40" w:name="Xcb356c1caa9fbeda96ee2c63dcee98915ebf571"/>
+    <w:bookmarkEnd w:id="38"/>
+    <w:bookmarkStart w:id="39" w:name="Xcb356c1caa9fbeda96ee2c63dcee98915ebf571"/>
     <w:p>
       <w:pPr>
         <w:pStyle w:val="Heading2"/>
@@ -2800,8 +2228,8 @@
         <w:t xml:space="preserve">, so the set is not a complete account of the practice it came from.</w:t>
       </w:r>
     </w:p>
-    <w:bookmarkEnd w:id="40"/>
-    <w:bookmarkStart w:id="43" w:name="what-is-already-elsewhere-on-this-site"/>
+    <w:bookmarkEnd w:id="39"/>
+    <w:bookmarkStart w:id="42" w:name="what-is-already-elsewhere-on-this-site"/>
     <w:p>
       <w:pPr>
         <w:pStyle w:val="Heading2"/>
@@ -2867,7 +2295,7 @@
           <w:numId w:val="1007"/>
         </w:numPr>
       </w:pPr>
-      <w:hyperlink r:id="rId41">
+      <w:hyperlink r:id="rId40">
         <w:r>
           <w:rPr>
             <w:rStyle w:val="Hyperlink"/>
@@ -2931,7 +2359,7 @@
           <w:numId w:val="1007"/>
         </w:numPr>
       </w:pPr>
-      <w:hyperlink r:id="rId42">
+      <w:hyperlink r:id="rId41">
         <w:r>
           <w:rPr>
             <w:rStyle w:val="Hyperlink"/>
@@ -2952,8 +2380,8 @@
         <w:t xml:space="preserve">guardrail and proving it can see what it claims to.</w:t>
       </w:r>
     </w:p>
+    <w:bookmarkEnd w:id="42"/>
     <w:bookmarkEnd w:id="43"/>
-    <w:bookmarkEnd w:id="44"/>
     <w:sectPr>
       <w:footnotePr>
         <w:numRestart w:val="eachSect"/>

</xml_diff>

<commit_message>
docs(standards): put the reading order right under the table it describes
'Rows are in the recommended reading order' asked the reader to take that on
faith and scroll for the reasons, five sections down. The reasons are the useful
part -- which document changes soonest, which is shortest, which you should
expect to rewrite rather than adopt.

The section now sits directly under the table, and the pointer line is gone
because the thing it pointed at is there. Nothing else referenced the anchor, so
no link had to move, and the anchor still exists at its new position.

OVERVIEW.docx regenerated. Verified: check-ascii clean, 35 tests pass.
</commit_message>
<xml_diff>
--- a/docs/standards/word/OVERVIEW.docx
+++ b/docs/standards/word/OVERVIEW.docx
@@ -874,26 +874,201 @@
         </w:tc>
       </w:tr>
     </w:tbl>
-    <w:p>
-      <w:pPr>
-        <w:pStyle w:val="BodyText"/>
-      </w:pPr>
-      <w:r>
-        <w:t xml:space="preserve">Rows are in the</w:t>
-      </w:r>
-      <w:r>
-        <w:t xml:space="preserve"> </w:t>
-      </w:r>
-      <w:hyperlink w:anchor="the-order-to-read-them-in">
+    <w:bookmarkEnd w:id="33"/>
+    <w:bookmarkStart w:id="34" w:name="the-order-to-read-them-in"/>
+    <w:p>
+      <w:pPr>
+        <w:pStyle w:val="Heading2"/>
+      </w:pPr>
+      <w:r>
+        <w:t xml:space="preserve">The order to read them in</w:t>
+      </w:r>
+    </w:p>
+    <w:p>
+      <w:pPr>
+        <w:pStyle w:val="Compact"/>
+        <w:numPr>
+          <w:ilvl w:val="0"/>
+          <w:numId w:val="1002"/>
+        </w:numPr>
+      </w:pPr>
+      <w:hyperlink r:id="rId12">
         <w:r>
           <w:rPr>
             <w:rStyle w:val="Hyperlink"/>
+            <w:b/>
+            <w:bCs/>
           </w:rPr>
-          <w:t xml:space="preserve">recommended reading order</w:t>
+          <w:t xml:space="preserve">AI-assisted development</w:t>
         </w:r>
       </w:hyperlink>
       <w:r>
-        <w:t xml:space="preserve">.</w:t>
+        <w:t xml:space="preserve"> </w:t>
+      </w:r>
+      <w:r>
+        <w:t xml:space="preserve">first, because it is the one that</w:t>
+      </w:r>
+      <w:r>
+        <w:t xml:space="preserve"> </w:t>
+      </w:r>
+      <w:r>
+        <w:t xml:space="preserve">changes tomorrow rather than next quarter, and because its risk tier decides how much of the</w:t>
+      </w:r>
+      <w:r>
+        <w:t xml:space="preserve"> </w:t>
+      </w:r>
+      <w:r>
+        <w:t xml:space="preserve">rest applies to any given change.</w:t>
+      </w:r>
+    </w:p>
+    <w:p>
+      <w:pPr>
+        <w:pStyle w:val="Compact"/>
+        <w:numPr>
+          <w:ilvl w:val="0"/>
+          <w:numId w:val="1002"/>
+        </w:numPr>
+      </w:pPr>
+      <w:hyperlink r:id="rId18">
+        <w:r>
+          <w:rPr>
+            <w:rStyle w:val="Hyperlink"/>
+            <w:b/>
+            <w:bCs/>
+          </w:rPr>
+          <w:t xml:space="preserve">Human review of code</w:t>
+        </w:r>
+      </w:hyperlink>
+      <w:r>
+        <w:t xml:space="preserve"> </w:t>
+      </w:r>
+      <w:r>
+        <w:t xml:space="preserve">second, and early on purpose. It answers the question a</w:t>
+      </w:r>
+      <w:r>
+        <w:t xml:space="preserve"> </w:t>
+      </w:r>
+      <w:r>
+        <w:t xml:space="preserve">manager asks before any of this gets funded -- how much of the code a human still has to read --</w:t>
+      </w:r>
+      <w:r>
+        <w:t xml:space="preserve"> </w:t>
+      </w:r>
+      <w:r>
+        <w:t xml:space="preserve">and it is the shortest of them.</w:t>
+      </w:r>
+    </w:p>
+    <w:p>
+      <w:pPr>
+        <w:pStyle w:val="Compact"/>
+        <w:numPr>
+          <w:ilvl w:val="0"/>
+          <w:numId w:val="1002"/>
+        </w:numPr>
+      </w:pPr>
+      <w:hyperlink r:id="rId15">
+        <w:r>
+          <w:rPr>
+            <w:rStyle w:val="Hyperlink"/>
+            <w:b/>
+            <w:bCs/>
+          </w:rPr>
+          <w:t xml:space="preserve">Dependency integrity</w:t>
+        </w:r>
+      </w:hyperlink>
+      <w:r>
+        <w:t xml:space="preserve"> </w:t>
+      </w:r>
+      <w:r>
+        <w:t xml:space="preserve">next. Its controls are the most mechanical of</w:t>
+      </w:r>
+      <w:r>
+        <w:t xml:space="preserve"> </w:t>
+      </w:r>
+      <w:r>
+        <w:t xml:space="preserve">the set, and you probably already have half of them; it is the one most likely to be adopted</w:t>
+      </w:r>
+      <w:r>
+        <w:t xml:space="preserve"> </w:t>
+      </w:r>
+      <w:r>
+        <w:t xml:space="preserve">close to whole.</w:t>
+      </w:r>
+    </w:p>
+    <w:p>
+      <w:pPr>
+        <w:pStyle w:val="Compact"/>
+        <w:numPr>
+          <w:ilvl w:val="0"/>
+          <w:numId w:val="1002"/>
+        </w:numPr>
+      </w:pPr>
+      <w:hyperlink r:id="rId21">
+        <w:r>
+          <w:rPr>
+            <w:rStyle w:val="Hyperlink"/>
+            <w:b/>
+            <w:bCs/>
+          </w:rPr>
+          <w:t xml:space="preserve">Code quality</w:t>
+        </w:r>
+      </w:hyperlink>
+      <w:r>
+        <w:t xml:space="preserve"> </w:t>
+      </w:r>
+      <w:r>
+        <w:t xml:space="preserve">fourth. It assumes you have somewhere to put a blocking check,</w:t>
+      </w:r>
+      <w:r>
+        <w:t xml:space="preserve"> </w:t>
+      </w:r>
+      <w:r>
+        <w:t xml:space="preserve">which the first two get you thinking about.</w:t>
+      </w:r>
+    </w:p>
+    <w:p>
+      <w:pPr>
+        <w:pStyle w:val="Compact"/>
+        <w:numPr>
+          <w:ilvl w:val="0"/>
+          <w:numId w:val="1002"/>
+        </w:numPr>
+      </w:pPr>
+      <w:hyperlink r:id="rId24">
+        <w:r>
+          <w:rPr>
+            <w:rStyle w:val="Hyperlink"/>
+            <w:b/>
+            <w:bCs/>
+          </w:rPr>
+          <w:t xml:space="preserve">Secure development</w:t>
+        </w:r>
+      </w:hyperlink>
+      <w:r>
+        <w:t xml:space="preserve"> </w:t>
+      </w:r>
+      <w:r>
+        <w:t xml:space="preserve">last. It is the widest and the most</w:t>
+      </w:r>
+      <w:r>
+        <w:t xml:space="preserve"> </w:t>
+      </w:r>
+      <w:r>
+        <w:t xml:space="preserve">setting-specific, and it is the one you should expect to rewrite rather than adopt.</w:t>
+      </w:r>
+    </w:p>
+    <w:p>
+      <w:pPr>
+        <w:pStyle w:val="FirstParagraph"/>
+      </w:pPr>
+      <w:r>
+        <w:t xml:space="preserve">If you read only one paragraph of any of them, read its scope-and-limits block. That block is what</w:t>
+      </w:r>
+      <w:r>
+        <w:t xml:space="preserve"> </w:t>
+      </w:r>
+      <w:r>
+        <w:t xml:space="preserve">tells you whether the rest applies to you, and it is deliberately placed before the rules.</w:t>
       </w:r>
     </w:p>
     <w:p>
@@ -989,7 +1164,7 @@
         <w:pStyle w:val="Compact"/>
         <w:numPr>
           <w:ilvl w:val="0"/>
-          <w:numId w:val="1002"/>
+          <w:numId w:val="1003"/>
         </w:numPr>
       </w:pPr>
       <w:r>
@@ -1008,7 +1183,7 @@
         <w:pStyle w:val="Compact"/>
         <w:numPr>
           <w:ilvl w:val="0"/>
-          <w:numId w:val="1002"/>
+          <w:numId w:val="1003"/>
         </w:numPr>
       </w:pPr>
       <w:r>
@@ -1030,7 +1205,7 @@
         <w:pStyle w:val="Compact"/>
         <w:numPr>
           <w:ilvl w:val="0"/>
-          <w:numId w:val="1002"/>
+          <w:numId w:val="1003"/>
         </w:numPr>
       </w:pPr>
       <w:r>
@@ -1205,8 +1380,8 @@
         <w:t xml:space="preserve">-- adapt them, publish the result, drop the attribution.</w:t>
       </w:r>
     </w:p>
-    <w:bookmarkEnd w:id="33"/>
-    <w:bookmarkStart w:id="34" w:name="what-you-get"/>
+    <w:bookmarkEnd w:id="34"/>
+    <w:bookmarkStart w:id="35" w:name="what-you-get"/>
     <w:p>
       <w:pPr>
         <w:pStyle w:val="Heading2"/>
@@ -1220,7 +1395,7 @@
         <w:pStyle w:val="Compact"/>
         <w:numPr>
           <w:ilvl w:val="0"/>
-          <w:numId w:val="1003"/>
+          <w:numId w:val="1004"/>
         </w:numPr>
       </w:pPr>
       <w:r>
@@ -1257,7 +1432,7 @@
         <w:pStyle w:val="Compact"/>
         <w:numPr>
           <w:ilvl w:val="0"/>
-          <w:numId w:val="1003"/>
+          <w:numId w:val="1004"/>
         </w:numPr>
       </w:pPr>
       <w:r>
@@ -1291,7 +1466,7 @@
         <w:pStyle w:val="Compact"/>
         <w:numPr>
           <w:ilvl w:val="0"/>
-          <w:numId w:val="1003"/>
+          <w:numId w:val="1004"/>
         </w:numPr>
       </w:pPr>
       <w:r>
@@ -1322,7 +1497,7 @@
         <w:pStyle w:val="Compact"/>
         <w:numPr>
           <w:ilvl w:val="0"/>
-          <w:numId w:val="1003"/>
+          <w:numId w:val="1004"/>
         </w:numPr>
       </w:pPr>
       <w:r>
@@ -1347,7 +1522,7 @@
         <w:pStyle w:val="Compact"/>
         <w:numPr>
           <w:ilvl w:val="0"/>
-          <w:numId w:val="1003"/>
+          <w:numId w:val="1004"/>
         </w:numPr>
       </w:pPr>
       <w:r>
@@ -1378,7 +1553,7 @@
         <w:pStyle w:val="Compact"/>
         <w:numPr>
           <w:ilvl w:val="0"/>
-          <w:numId w:val="1003"/>
+          <w:numId w:val="1004"/>
         </w:numPr>
       </w:pPr>
       <w:r>
@@ -1412,7 +1587,7 @@
         <w:pStyle w:val="Compact"/>
         <w:numPr>
           <w:ilvl w:val="0"/>
-          <w:numId w:val="1003"/>
+          <w:numId w:val="1004"/>
         </w:numPr>
       </w:pPr>
       <w:r>
@@ -1435,8 +1610,8 @@
         <w:t xml:space="preserve">numbers to stop repeating, including several that circulate widely and did not survive the filter.</w:t>
       </w:r>
     </w:p>
-    <w:bookmarkEnd w:id="34"/>
-    <w:bookmarkStart w:id="36" w:name="what-these-are-not"/>
+    <w:bookmarkEnd w:id="35"/>
+    <w:bookmarkStart w:id="37" w:name="what-these-are-not"/>
     <w:p>
       <w:pPr>
         <w:pStyle w:val="Heading2"/>
@@ -1450,7 +1625,7 @@
         <w:pStyle w:val="Compact"/>
         <w:numPr>
           <w:ilvl w:val="0"/>
-          <w:numId w:val="1004"/>
+          <w:numId w:val="1005"/>
         </w:numPr>
       </w:pPr>
       <w:r>
@@ -1478,7 +1653,7 @@
         <w:pStyle w:val="Compact"/>
         <w:numPr>
           <w:ilvl w:val="0"/>
-          <w:numId w:val="1004"/>
+          <w:numId w:val="1005"/>
         </w:numPr>
       </w:pPr>
       <w:r>
@@ -1509,7 +1684,7 @@
       <w:r>
         <w:t xml:space="preserve"> </w:t>
       </w:r>
-      <w:hyperlink r:id="rId35">
+      <w:hyperlink r:id="rId36">
         <w:r>
           <w:rPr>
             <w:rStyle w:val="Hyperlink"/>
@@ -1526,7 +1701,7 @@
         <w:pStyle w:val="Compact"/>
         <w:numPr>
           <w:ilvl w:val="0"/>
-          <w:numId w:val="1004"/>
+          <w:numId w:val="1005"/>
         </w:numPr>
       </w:pPr>
       <w:r>
@@ -1560,7 +1735,7 @@
         <w:pStyle w:val="Compact"/>
         <w:numPr>
           <w:ilvl w:val="0"/>
-          <w:numId w:val="1004"/>
+          <w:numId w:val="1005"/>
         </w:numPr>
       </w:pPr>
       <w:r>
@@ -1583,8 +1758,8 @@
         <w:t xml:space="preserve">document says where it bears on a rule.</w:t>
       </w:r>
     </w:p>
-    <w:bookmarkEnd w:id="36"/>
-    <w:bookmarkStart w:id="37" w:name="what-each-one-buys-you"/>
+    <w:bookmarkEnd w:id="37"/>
+    <w:bookmarkStart w:id="38" w:name="what-each-one-buys-you"/>
     <w:p>
       <w:pPr>
         <w:pStyle w:val="Heading2"/>
@@ -1819,203 +1994,6 @@
         </w:tc>
       </w:tr>
     </w:tbl>
-    <w:bookmarkEnd w:id="37"/>
-    <w:bookmarkStart w:id="38" w:name="the-order-to-read-them-in"/>
-    <w:p>
-      <w:pPr>
-        <w:pStyle w:val="Heading2"/>
-      </w:pPr>
-      <w:r>
-        <w:t xml:space="preserve">The order to read them in</w:t>
-      </w:r>
-    </w:p>
-    <w:p>
-      <w:pPr>
-        <w:pStyle w:val="Compact"/>
-        <w:numPr>
-          <w:ilvl w:val="0"/>
-          <w:numId w:val="1005"/>
-        </w:numPr>
-      </w:pPr>
-      <w:hyperlink r:id="rId12">
-        <w:r>
-          <w:rPr>
-            <w:rStyle w:val="Hyperlink"/>
-            <w:b/>
-            <w:bCs/>
-          </w:rPr>
-          <w:t xml:space="preserve">AI-assisted development</w:t>
-        </w:r>
-      </w:hyperlink>
-      <w:r>
-        <w:t xml:space="preserve"> </w:t>
-      </w:r>
-      <w:r>
-        <w:t xml:space="preserve">first, because it is the one that</w:t>
-      </w:r>
-      <w:r>
-        <w:t xml:space="preserve"> </w:t>
-      </w:r>
-      <w:r>
-        <w:t xml:space="preserve">changes tomorrow rather than next quarter, and because its risk tier decides how much of the</w:t>
-      </w:r>
-      <w:r>
-        <w:t xml:space="preserve"> </w:t>
-      </w:r>
-      <w:r>
-        <w:t xml:space="preserve">rest applies to any given change.</w:t>
-      </w:r>
-    </w:p>
-    <w:p>
-      <w:pPr>
-        <w:pStyle w:val="Compact"/>
-        <w:numPr>
-          <w:ilvl w:val="0"/>
-          <w:numId w:val="1005"/>
-        </w:numPr>
-      </w:pPr>
-      <w:hyperlink r:id="rId18">
-        <w:r>
-          <w:rPr>
-            <w:rStyle w:val="Hyperlink"/>
-            <w:b/>
-            <w:bCs/>
-          </w:rPr>
-          <w:t xml:space="preserve">Human review of code</w:t>
-        </w:r>
-      </w:hyperlink>
-      <w:r>
-        <w:t xml:space="preserve"> </w:t>
-      </w:r>
-      <w:r>
-        <w:t xml:space="preserve">second, and early on purpose. It answers the question a</w:t>
-      </w:r>
-      <w:r>
-        <w:t xml:space="preserve"> </w:t>
-      </w:r>
-      <w:r>
-        <w:t xml:space="preserve">manager asks before any of this gets funded -- how much of the code a human still has to read --</w:t>
-      </w:r>
-      <w:r>
-        <w:t xml:space="preserve"> </w:t>
-      </w:r>
-      <w:r>
-        <w:t xml:space="preserve">and it is the shortest of them.</w:t>
-      </w:r>
-    </w:p>
-    <w:p>
-      <w:pPr>
-        <w:pStyle w:val="Compact"/>
-        <w:numPr>
-          <w:ilvl w:val="0"/>
-          <w:numId w:val="1005"/>
-        </w:numPr>
-      </w:pPr>
-      <w:hyperlink r:id="rId15">
-        <w:r>
-          <w:rPr>
-            <w:rStyle w:val="Hyperlink"/>
-            <w:b/>
-            <w:bCs/>
-          </w:rPr>
-          <w:t xml:space="preserve">Dependency integrity</w:t>
-        </w:r>
-      </w:hyperlink>
-      <w:r>
-        <w:t xml:space="preserve"> </w:t>
-      </w:r>
-      <w:r>
-        <w:t xml:space="preserve">next. Its controls are the most mechanical of</w:t>
-      </w:r>
-      <w:r>
-        <w:t xml:space="preserve"> </w:t>
-      </w:r>
-      <w:r>
-        <w:t xml:space="preserve">the set, and you probably already have half of them; it is the one most likely to be adopted</w:t>
-      </w:r>
-      <w:r>
-        <w:t xml:space="preserve"> </w:t>
-      </w:r>
-      <w:r>
-        <w:t xml:space="preserve">close to whole.</w:t>
-      </w:r>
-    </w:p>
-    <w:p>
-      <w:pPr>
-        <w:pStyle w:val="Compact"/>
-        <w:numPr>
-          <w:ilvl w:val="0"/>
-          <w:numId w:val="1005"/>
-        </w:numPr>
-      </w:pPr>
-      <w:hyperlink r:id="rId21">
-        <w:r>
-          <w:rPr>
-            <w:rStyle w:val="Hyperlink"/>
-            <w:b/>
-            <w:bCs/>
-          </w:rPr>
-          <w:t xml:space="preserve">Code quality</w:t>
-        </w:r>
-      </w:hyperlink>
-      <w:r>
-        <w:t xml:space="preserve"> </w:t>
-      </w:r>
-      <w:r>
-        <w:t xml:space="preserve">fourth. It assumes you have somewhere to put a blocking check,</w:t>
-      </w:r>
-      <w:r>
-        <w:t xml:space="preserve"> </w:t>
-      </w:r>
-      <w:r>
-        <w:t xml:space="preserve">which the first two get you thinking about.</w:t>
-      </w:r>
-    </w:p>
-    <w:p>
-      <w:pPr>
-        <w:pStyle w:val="Compact"/>
-        <w:numPr>
-          <w:ilvl w:val="0"/>
-          <w:numId w:val="1005"/>
-        </w:numPr>
-      </w:pPr>
-      <w:hyperlink r:id="rId24">
-        <w:r>
-          <w:rPr>
-            <w:rStyle w:val="Hyperlink"/>
-            <w:b/>
-            <w:bCs/>
-          </w:rPr>
-          <w:t xml:space="preserve">Secure development</w:t>
-        </w:r>
-      </w:hyperlink>
-      <w:r>
-        <w:t xml:space="preserve"> </w:t>
-      </w:r>
-      <w:r>
-        <w:t xml:space="preserve">last. It is the widest and the most</w:t>
-      </w:r>
-      <w:r>
-        <w:t xml:space="preserve"> </w:t>
-      </w:r>
-      <w:r>
-        <w:t xml:space="preserve">setting-specific, and it is the one you should expect to rewrite rather than adopt.</w:t>
-      </w:r>
-    </w:p>
-    <w:p>
-      <w:pPr>
-        <w:pStyle w:val="FirstParagraph"/>
-      </w:pPr>
-      <w:r>
-        <w:t xml:space="preserve">If you read only one paragraph of any of them, read its scope-and-limits block. That block is what</w:t>
-      </w:r>
-      <w:r>
-        <w:t xml:space="preserve"> </w:t>
-      </w:r>
-      <w:r>
-        <w:t xml:space="preserve">tells you whether the rest applies to you, and it is deliberately placed before the rules.</w:t>
-      </w:r>
-    </w:p>
     <w:bookmarkEnd w:id="38"/>
     <w:bookmarkStart w:id="39" w:name="Xcb356c1caa9fbeda96ee2c63dcee98915ebf571"/>
     <w:p>
@@ -2260,7 +2238,7 @@
           <w:numId w:val="1007"/>
         </w:numPr>
       </w:pPr>
-      <w:hyperlink r:id="rId35">
+      <w:hyperlink r:id="rId36">
         <w:r>
           <w:rPr>
             <w:rStyle w:val="Hyperlink"/>
@@ -2717,12 +2695,6 @@
     </w:lvlOverride>
   </w:num>
   <w:num w:numId="1003">
-    <w:abstractNumId w:val="991"/>
-  </w:num>
-  <w:num w:numId="1004">
-    <w:abstractNumId w:val="991"/>
-  </w:num>
-  <w:num w:numId="1005">
     <w:abstractNumId w:val="99411"/>
     <w:lvlOverride w:ilvl="0">
       <w:startOverride w:val="1"/>
@@ -2751,6 +2723,12 @@
     <w:lvlOverride w:ilvl="8">
       <w:startOverride w:val="1"/>
     </w:lvlOverride>
+  </w:num>
+  <w:num w:numId="1004">
+    <w:abstractNumId w:val="991"/>
+  </w:num>
+  <w:num w:numId="1005">
+    <w:abstractNumId w:val="991"/>
   </w:num>
   <w:num w:numId="1006">
     <w:abstractNumId w:val="991"/>

</xml_diff>

<commit_message>
docs(standards): cut the preamble and the format explainer
The page opened by listing what the documents cover, then the files table
listed the same thing with links. A reader met the set twice before reaching
anything they could click.

Also cuts the two paragraphs explaining what markdown and Word are. The
bolded line above them already says which format is for which audience, and
the paragraphs spent nine lines on it. Keeps that line.

The CISO summary loses its introductory paragraph but keeps the first row of
the files table, so nothing becomes harder to find. The MIT terms now live
only in LICENSE and the repository README.
</commit_message>
<xml_diff>
--- a/docs/standards/word/OVERVIEW.docx
+++ b/docs/standards/word/OVERVIEW.docx
@@ -28,7 +28,7 @@
         </w:p>
       </w:sdtContent>
     </w:sdt>
-    <w:bookmarkStart w:id="43" w:name="standards-you-can-start-from"/>
+    <w:bookmarkStart w:id="49" w:name="standards-you-can-start-from"/>
     <w:p>
       <w:pPr>
         <w:pStyle w:val="Heading1"/>
@@ -58,98 +58,7 @@
         <w:t xml:space="preserve"> </w:t>
       </w:r>
       <w:r>
-        <w:t xml:space="preserve">high-quality code using Claude Code:</w:t>
-      </w:r>
-    </w:p>
-    <w:p>
-      <w:pPr>
-        <w:pStyle w:val="Compact"/>
-        <w:numPr>
-          <w:ilvl w:val="0"/>
-          <w:numId w:val="1001"/>
-        </w:numPr>
-      </w:pPr>
-      <w:r>
-        <w:t xml:space="preserve">what counts as quality</w:t>
-      </w:r>
-    </w:p>
-    <w:p>
-      <w:pPr>
-        <w:pStyle w:val="Compact"/>
-        <w:numPr>
-          <w:ilvl w:val="0"/>
-          <w:numId w:val="1001"/>
-        </w:numPr>
-      </w:pPr>
-      <w:r>
-        <w:t xml:space="preserve">what counts as secure</w:t>
-      </w:r>
-    </w:p>
-    <w:p>
-      <w:pPr>
-        <w:pStyle w:val="Compact"/>
-        <w:numPr>
-          <w:ilvl w:val="0"/>
-          <w:numId w:val="1001"/>
-        </w:numPr>
-      </w:pPr>
-      <w:r>
-        <w:t xml:space="preserve">how to hold third-party code you will never read</w:t>
-      </w:r>
-    </w:p>
-    <w:p>
-      <w:pPr>
-        <w:pStyle w:val="Compact"/>
-        <w:numPr>
-          <w:ilvl w:val="0"/>
-          <w:numId w:val="1001"/>
-        </w:numPr>
-      </w:pPr>
-      <w:r>
-        <w:t xml:space="preserve">how to govern Claude Code, or another AI coding assistant, when it writes much of it</w:t>
-      </w:r>
-    </w:p>
-    <w:p>
-      <w:pPr>
-        <w:pStyle w:val="Compact"/>
-        <w:numPr>
-          <w:ilvl w:val="0"/>
-          <w:numId w:val="1001"/>
-        </w:numPr>
-      </w:pPr>
-      <w:r>
-        <w:t xml:space="preserve">how much of the result a human must actually read</w:t>
-      </w:r>
-    </w:p>
-    <w:p>
-      <w:pPr>
-        <w:pStyle w:val="FirstParagraph"/>
-      </w:pPr>
-      <w:r>
-        <w:t xml:space="preserve">Plus</w:t>
-      </w:r>
-      <w:r>
-        <w:t xml:space="preserve"> </w:t>
-      </w:r>
-      <w:hyperlink r:id="rId9">
-        <w:r>
-          <w:rPr>
-            <w:rStyle w:val="Hyperlink"/>
-          </w:rPr>
-          <w:t xml:space="preserve">a two-page summary</w:t>
-        </w:r>
-      </w:hyperlink>
-      <w:r>
-        <w:t xml:space="preserve"> </w:t>
-      </w:r>
-      <w:r>
-        <w:t xml:space="preserve">for a security executive. It answers a different</w:t>
-      </w:r>
-      <w:r>
-        <w:t xml:space="preserve"> </w:t>
-      </w:r>
-      <w:r>
-        <w:t xml:space="preserve">question: not how to adopt any of this, but how to tell whether your teams already do it.</w:t>
+        <w:t xml:space="preserve">high-quality code using Claude Code.</w:t>
       </w:r>
     </w:p>
     <w:p>
@@ -182,7 +91,7 @@
         <w:t xml:space="preserve">edited down to your setting before it is useful.</w:t>
       </w:r>
     </w:p>
-    <w:bookmarkStart w:id="33" w:name="the-files"/>
+    <w:bookmarkStart w:id="39" w:name="the-files"/>
     <w:p>
       <w:pPr>
         <w:pStyle w:val="Heading2"/>
@@ -335,7 +244,13 @@
                 <w:b/>
                 <w:bCs/>
               </w:rPr>
-              <w:t xml:space="preserve">AI-assisted development</w:t>
+              <w:t xml:space="preserve">Which security standards apply to you</w:t>
+            </w:r>
+            <w:r>
+              <w:t xml:space="preserve"> </w:t>
+            </w:r>
+            <w:r>
+              <w:t xml:space="preserve">-- a map of the landscape, for deciding what reaches you</w:t>
             </w:r>
           </w:p>
         </w:tc>
@@ -400,7 +315,13 @@
                 <w:b/>
                 <w:bCs/>
               </w:rPr>
-              <w:t xml:space="preserve">Dependency integrity</w:t>
+              <w:t xml:space="preserve">How to adopt these</w:t>
+            </w:r>
+            <w:r>
+              <w:t xml:space="preserve"> </w:t>
+            </w:r>
+            <w:r>
+              <w:t xml:space="preserve">-- what to do with the rest of this section</w:t>
             </w:r>
           </w:p>
         </w:tc>
@@ -465,13 +386,7 @@
                 <w:b/>
                 <w:bCs/>
               </w:rPr>
-              <w:t xml:space="preserve">Human review of code</w:t>
-            </w:r>
-            <w:r>
-              <w:t xml:space="preserve"> </w:t>
-            </w:r>
-            <w:r>
-              <w:t xml:space="preserve">-- how much of it a human must read</w:t>
+              <w:t xml:space="preserve">AI-assisted development</w:t>
             </w:r>
           </w:p>
         </w:tc>
@@ -536,7 +451,7 @@
                 <w:b/>
                 <w:bCs/>
               </w:rPr>
-              <w:t xml:space="preserve">Code quality</w:t>
+              <w:t xml:space="preserve">Dependency integrity</w:t>
             </w:r>
           </w:p>
         </w:tc>
@@ -601,7 +516,13 @@
                 <w:b/>
                 <w:bCs/>
               </w:rPr>
-              <w:t xml:space="preserve">Secure development</w:t>
+              <w:t xml:space="preserve">Human review of code</w:t>
+            </w:r>
+            <w:r>
+              <w:t xml:space="preserve"> </w:t>
+            </w:r>
+            <w:r>
+              <w:t xml:space="preserve">-- how much of it a human must read</w:t>
             </w:r>
           </w:p>
         </w:tc>
@@ -666,13 +587,7 @@
                 <w:b/>
                 <w:bCs/>
               </w:rPr>
-              <w:t xml:space="preserve">Security standard assessment</w:t>
-            </w:r>
-            <w:r>
-              <w:t xml:space="preserve"> </w:t>
-            </w:r>
-            <w:r>
-              <w:t xml:space="preserve">-- running one against a large standard</w:t>
+              <w:t xml:space="preserve">Code quality</w:t>
             </w:r>
           </w:p>
         </w:tc>
@@ -733,18 +648,11 @@
               <w:pStyle w:val="Compact"/>
             </w:pPr>
             <w:r>
-              <w:t xml:space="preserve">This overview</w:t>
-            </w:r>
-          </w:p>
-        </w:tc>
-        <w:tc>
-          <w:tcPr/>
-          <w:p>
-            <w:pPr>
-              <w:pStyle w:val="Compact"/>
-            </w:pPr>
-            <w:r>
-              <w:t xml:space="preserve">--</w:t>
+              <w:rPr>
+                <w:b/>
+                <w:bCs/>
+              </w:rPr>
+              <w:t xml:space="preserve">Secure development</w:t>
             </w:r>
           </w:p>
         </w:tc>
@@ -755,6 +663,22 @@
               <w:pStyle w:val="Compact"/>
             </w:pPr>
             <w:hyperlink r:id="rId30">
+              <w:r>
+                <w:rPr>
+                  <w:rStyle w:val="Hyperlink"/>
+                </w:rPr>
+                <w:t xml:space="preserve">page</w:t>
+              </w:r>
+            </w:hyperlink>
+          </w:p>
+        </w:tc>
+        <w:tc>
+          <w:tcPr/>
+          <w:p>
+            <w:pPr>
+              <w:pStyle w:val="Compact"/>
+            </w:pPr>
+            <w:hyperlink r:id="rId31">
               <w:r>
                 <w:rPr>
                   <w:rStyle w:val="Hyperlink"/>
@@ -770,7 +694,7 @@
             <w:pPr>
               <w:pStyle w:val="Compact"/>
             </w:pPr>
-            <w:hyperlink r:id="rId31">
+            <w:hyperlink r:id="rId32">
               <w:r>
                 <w:rPr>
                   <w:rStyle w:val="Hyperlink"/>
@@ -793,6 +717,133 @@
                 <w:b/>
                 <w:bCs/>
               </w:rPr>
+              <w:t xml:space="preserve">Security standard assessment</w:t>
+            </w:r>
+            <w:r>
+              <w:t xml:space="preserve"> </w:t>
+            </w:r>
+            <w:r>
+              <w:t xml:space="preserve">-- running one against a large standard</w:t>
+            </w:r>
+          </w:p>
+        </w:tc>
+        <w:tc>
+          <w:tcPr/>
+          <w:p>
+            <w:pPr>
+              <w:pStyle w:val="Compact"/>
+            </w:pPr>
+            <w:hyperlink r:id="rId33">
+              <w:r>
+                <w:rPr>
+                  <w:rStyle w:val="Hyperlink"/>
+                </w:rPr>
+                <w:t xml:space="preserve">page</w:t>
+              </w:r>
+            </w:hyperlink>
+          </w:p>
+        </w:tc>
+        <w:tc>
+          <w:tcPr/>
+          <w:p>
+            <w:pPr>
+              <w:pStyle w:val="Compact"/>
+            </w:pPr>
+            <w:hyperlink r:id="rId34">
+              <w:r>
+                <w:rPr>
+                  <w:rStyle w:val="Hyperlink"/>
+                </w:rPr>
+                <w:t xml:space="preserve">.md</w:t>
+              </w:r>
+            </w:hyperlink>
+          </w:p>
+        </w:tc>
+        <w:tc>
+          <w:tcPr/>
+          <w:p>
+            <w:pPr>
+              <w:pStyle w:val="Compact"/>
+            </w:pPr>
+            <w:hyperlink r:id="rId35">
+              <w:r>
+                <w:rPr>
+                  <w:rStyle w:val="Hyperlink"/>
+                </w:rPr>
+                <w:t xml:space="preserve">.docx</w:t>
+              </w:r>
+            </w:hyperlink>
+          </w:p>
+        </w:tc>
+      </w:tr>
+      <w:tr>
+        <w:tc>
+          <w:tcPr/>
+          <w:p>
+            <w:pPr>
+              <w:pStyle w:val="Compact"/>
+            </w:pPr>
+            <w:r>
+              <w:t xml:space="preserve">This overview</w:t>
+            </w:r>
+          </w:p>
+        </w:tc>
+        <w:tc>
+          <w:tcPr/>
+          <w:p>
+            <w:pPr>
+              <w:pStyle w:val="Compact"/>
+            </w:pPr>
+            <w:r>
+              <w:t xml:space="preserve">--</w:t>
+            </w:r>
+          </w:p>
+        </w:tc>
+        <w:tc>
+          <w:tcPr/>
+          <w:p>
+            <w:pPr>
+              <w:pStyle w:val="Compact"/>
+            </w:pPr>
+            <w:hyperlink r:id="rId36">
+              <w:r>
+                <w:rPr>
+                  <w:rStyle w:val="Hyperlink"/>
+                </w:rPr>
+                <w:t xml:space="preserve">.md</w:t>
+              </w:r>
+            </w:hyperlink>
+          </w:p>
+        </w:tc>
+        <w:tc>
+          <w:tcPr/>
+          <w:p>
+            <w:pPr>
+              <w:pStyle w:val="Compact"/>
+            </w:pPr>
+            <w:hyperlink r:id="rId37">
+              <w:r>
+                <w:rPr>
+                  <w:rStyle w:val="Hyperlink"/>
+                </w:rPr>
+                <w:t xml:space="preserve">.docx</w:t>
+              </w:r>
+            </w:hyperlink>
+          </w:p>
+        </w:tc>
+      </w:tr>
+      <w:tr>
+        <w:tc>
+          <w:tcPr/>
+          <w:p>
+            <w:pPr>
+              <w:pStyle w:val="Compact"/>
+            </w:pPr>
+            <w:r>
+              <w:rPr>
+                <w:b/>
+                <w:bCs/>
+              </w:rPr>
               <w:t xml:space="preserve">A</w:t>
             </w:r>
             <w:r>
@@ -864,7 +915,7 @@
             <w:pPr>
               <w:pStyle w:val="Compact"/>
             </w:pPr>
-            <w:hyperlink r:id="rId32">
+            <w:hyperlink r:id="rId38">
               <w:r>
                 <w:rPr>
                   <w:rStyle w:val="Hyperlink"/>
@@ -899,66 +950,8 @@
         <w:t xml:space="preserve">Markdown is best for sharing with AI. Word is best for sharing with humans.</w:t>
       </w:r>
     </w:p>
-    <w:p>
-      <w:pPr>
-        <w:pStyle w:val="BodyText"/>
-      </w:pPr>
-      <w:r>
-        <w:t xml:space="preserve">Markdown is plain text: harder on a human eye, with its syntax showing and its tables unaligned. It</w:t>
-      </w:r>
-      <w:r>
-        <w:t xml:space="preserve"> </w:t>
-      </w:r>
-      <w:r>
-        <w:t xml:space="preserve">is easier for an AI to work with, because that same plain text is exactly what a coding tool reads</w:t>
-      </w:r>
-      <w:r>
-        <w:t xml:space="preserve"> </w:t>
-      </w:r>
-      <w:r>
-        <w:t xml:space="preserve">best. It also drops into a repository and diffs cleanly as you edit it -- which you will, because</w:t>
-      </w:r>
-      <w:r>
-        <w:t xml:space="preserve"> </w:t>
-      </w:r>
-      <w:r>
-        <w:t xml:space="preserve">none of these are usable as they stand.</w:t>
-      </w:r>
-    </w:p>
-    <w:p>
-      <w:pPr>
-        <w:pStyle w:val="BodyText"/>
-      </w:pPr>
-      <w:r>
-        <w:t xml:space="preserve">Word is the reverse: comfortable to read, easy to circulate and mark up, and of no use to a coding</w:t>
-      </w:r>
-      <w:r>
-        <w:t xml:space="preserve"> </w:t>
-      </w:r>
-      <w:r>
-        <w:t xml:space="preserve">tool. The Word files hold the same content, generated from the same markdown.</w:t>
-      </w:r>
-    </w:p>
-    <w:p>
-      <w:pPr>
-        <w:pStyle w:val="BodyText"/>
-      </w:pPr>
-      <w:r>
-        <w:rPr>
-          <w:b/>
-          <w:bCs/>
-        </w:rPr>
-        <w:t xml:space="preserve">MIT licensed</w:t>
-      </w:r>
-      <w:r>
-        <w:t xml:space="preserve"> </w:t>
-      </w:r>
-      <w:r>
-        <w:t xml:space="preserve">-- adapt them, publish the result, drop the attribution.</w:t>
-      </w:r>
-    </w:p>
-    <w:bookmarkEnd w:id="33"/>
-    <w:bookmarkStart w:id="34" w:name="the-order-to-read-them-in"/>
+    <w:bookmarkEnd w:id="39"/>
+    <w:bookmarkStart w:id="40" w:name="the-order-to-read-them-in"/>
     <w:p>
       <w:pPr>
         <w:pStyle w:val="Heading2"/>
@@ -972,10 +965,10 @@
         <w:pStyle w:val="Compact"/>
         <w:numPr>
           <w:ilvl w:val="0"/>
-          <w:numId w:val="1002"/>
+          <w:numId w:val="1001"/>
         </w:numPr>
       </w:pPr>
-      <w:hyperlink r:id="rId12">
+      <w:hyperlink r:id="rId18">
         <w:r>
           <w:rPr>
             <w:rStyle w:val="Hyperlink"/>
@@ -1009,10 +1002,10 @@
         <w:pStyle w:val="Compact"/>
         <w:numPr>
           <w:ilvl w:val="0"/>
-          <w:numId w:val="1002"/>
+          <w:numId w:val="1001"/>
         </w:numPr>
       </w:pPr>
-      <w:hyperlink r:id="rId18">
+      <w:hyperlink r:id="rId24">
         <w:r>
           <w:rPr>
             <w:rStyle w:val="Hyperlink"/>
@@ -1040,10 +1033,10 @@
         <w:pStyle w:val="Compact"/>
         <w:numPr>
           <w:ilvl w:val="0"/>
-          <w:numId w:val="1002"/>
+          <w:numId w:val="1001"/>
         </w:numPr>
       </w:pPr>
-      <w:hyperlink r:id="rId15">
+      <w:hyperlink r:id="rId21">
         <w:r>
           <w:rPr>
             <w:rStyle w:val="Hyperlink"/>
@@ -1077,10 +1070,10 @@
         <w:pStyle w:val="Compact"/>
         <w:numPr>
           <w:ilvl w:val="0"/>
-          <w:numId w:val="1002"/>
+          <w:numId w:val="1001"/>
         </w:numPr>
       </w:pPr>
-      <w:hyperlink r:id="rId21">
+      <w:hyperlink r:id="rId27">
         <w:r>
           <w:rPr>
             <w:rStyle w:val="Hyperlink"/>
@@ -1108,10 +1101,10 @@
         <w:pStyle w:val="Compact"/>
         <w:numPr>
           <w:ilvl w:val="0"/>
-          <w:numId w:val="1002"/>
+          <w:numId w:val="1001"/>
         </w:numPr>
       </w:pPr>
-      <w:hyperlink r:id="rId24">
+      <w:hyperlink r:id="rId30">
         <w:r>
           <w:rPr>
             <w:rStyle w:val="Hyperlink"/>
@@ -1168,7 +1161,7 @@
       <w:r>
         <w:t xml:space="preserve"> </w:t>
       </w:r>
-      <w:hyperlink r:id="rId18">
+      <w:hyperlink r:id="rId24">
         <w:r>
           <w:rPr>
             <w:rStyle w:val="Hyperlink"/>
@@ -1286,7 +1279,7 @@
       <w:r>
         <w:t xml:space="preserve"> </w:t>
       </w:r>
-      <w:hyperlink r:id="rId32">
+      <w:hyperlink r:id="rId38">
         <w:r>
           <w:rPr>
             <w:rStyle w:val="Hyperlink"/>
@@ -1307,14 +1300,253 @@
         <w:t xml:space="preserve">able to fail. A standard that no such file references is a document, not a practice.</w:t>
       </w:r>
     </w:p>
-    <w:bookmarkEnd w:id="34"/>
-    <w:bookmarkStart w:id="35" w:name="what-you-get"/>
+    <w:bookmarkEnd w:id="40"/>
+    <w:bookmarkStart w:id="41" w:name="what-you-get"/>
     <w:p>
       <w:pPr>
         <w:pStyle w:val="Heading2"/>
       </w:pPr>
       <w:r>
         <w:t xml:space="preserve">What you get</w:t>
+      </w:r>
+    </w:p>
+    <w:p>
+      <w:pPr>
+        <w:pStyle w:val="Compact"/>
+        <w:numPr>
+          <w:ilvl w:val="0"/>
+          <w:numId w:val="1002"/>
+        </w:numPr>
+      </w:pPr>
+      <w:r>
+        <w:rPr>
+          <w:b/>
+          <w:bCs/>
+        </w:rPr>
+        <w:t xml:space="preserve">A rubric you can run against your own repository at each release.</w:t>
+      </w:r>
+      <w:r>
+        <w:t xml:space="preserve"> </w:t>
+      </w:r>
+      <w:r>
+        <w:t xml:space="preserve">It separates controls that</w:t>
+      </w:r>
+      <w:r>
+        <w:t xml:space="preserve"> </w:t>
+      </w:r>
+      <w:r>
+        <w:t xml:space="preserve">may decide a verdict from measurements that may only start a conversation. So an argument about</w:t>
+      </w:r>
+      <w:r>
+        <w:t xml:space="preserve"> </w:t>
+      </w:r>
+      <w:r>
+        <w:t xml:space="preserve">"is this good enough" resolves against structure rather than against whoever quotes the largest</w:t>
+      </w:r>
+      <w:r>
+        <w:t xml:space="preserve"> </w:t>
+      </w:r>
+      <w:r>
+        <w:t xml:space="preserve">number.</w:t>
+      </w:r>
+    </w:p>
+    <w:p>
+      <w:pPr>
+        <w:pStyle w:val="Compact"/>
+        <w:numPr>
+          <w:ilvl w:val="0"/>
+          <w:numId w:val="1002"/>
+        </w:numPr>
+      </w:pPr>
+      <w:r>
+        <w:rPr>
+          <w:b/>
+          <w:bCs/>
+        </w:rPr>
+        <w:t xml:space="preserve">A discipline for third-party code that never asks you to read it.</w:t>
+      </w:r>
+      <w:r>
+        <w:t xml:space="preserve"> </w:t>
+      </w:r>
+      <w:r>
+        <w:t xml:space="preserve">The human effort lands at</w:t>
+      </w:r>
+      <w:r>
+        <w:t xml:space="preserve"> </w:t>
+      </w:r>
+      <w:r>
+        <w:t xml:space="preserve">exactly two moments: adopting a dependency and bumping one. The rest is machinery that runs</w:t>
+      </w:r>
+      <w:r>
+        <w:t xml:space="preserve"> </w:t>
+      </w:r>
+      <w:r>
+        <w:t xml:space="preserve">unattended until it raises something.</w:t>
+      </w:r>
+    </w:p>
+    <w:p>
+      <w:pPr>
+        <w:pStyle w:val="Compact"/>
+        <w:numPr>
+          <w:ilvl w:val="0"/>
+          <w:numId w:val="1002"/>
+        </w:numPr>
+      </w:pPr>
+      <w:r>
+        <w:rPr>
+          <w:b/>
+          <w:bCs/>
+        </w:rPr>
+        <w:t xml:space="preserve">A release an adopter can verify without trusting your account of your own process.</w:t>
+      </w:r>
+      <w:r>
+        <w:t xml:space="preserve"> </w:t>
+      </w:r>
+      <w:r>
+        <w:t xml:space="preserve">The</w:t>
+      </w:r>
+      <w:r>
+        <w:t xml:space="preserve"> </w:t>
+      </w:r>
+      <w:r>
+        <w:t xml:space="preserve">allowlist is checked before the upload rather than after it, because the upload is the</w:t>
+      </w:r>
+      <w:r>
+        <w:t xml:space="preserve"> </w:t>
+      </w:r>
+      <w:r>
+        <w:t xml:space="preserve">irreversible step.</w:t>
+      </w:r>
+    </w:p>
+    <w:p>
+      <w:pPr>
+        <w:pStyle w:val="Compact"/>
+        <w:numPr>
+          <w:ilvl w:val="0"/>
+          <w:numId w:val="1002"/>
+        </w:numPr>
+      </w:pPr>
+      <w:r>
+        <w:rPr>
+          <w:b/>
+          <w:bCs/>
+        </w:rPr>
+        <w:t xml:space="preserve">A written split between what you own and what an adopter owns</w:t>
+      </w:r>
+      <w:r>
+        <w:t xml:space="preserve">, made before you claim any</w:t>
+      </w:r>
+      <w:r>
+        <w:t xml:space="preserve"> </w:t>
+      </w:r>
+      <w:r>
+        <w:t xml:space="preserve">control. That gap is where a control ends up unowned by both sides, each assuming the other had</w:t>
+      </w:r>
+      <w:r>
+        <w:t xml:space="preserve"> </w:t>
+      </w:r>
+      <w:r>
+        <w:t xml:space="preserve">it.</w:t>
+      </w:r>
+    </w:p>
+    <w:p>
+      <w:pPr>
+        <w:pStyle w:val="Compact"/>
+        <w:numPr>
+          <w:ilvl w:val="0"/>
+          <w:numId w:val="1002"/>
+        </w:numPr>
+      </w:pPr>
+      <w:r>
+        <w:rPr>
+          <w:b/>
+          <w:bCs/>
+        </w:rPr>
+        <w:t xml:space="preserve">A risk tier you can resolve in one question.</w:t>
+      </w:r>
+      <w:r>
+        <w:t xml:space="preserve"> </w:t>
+      </w:r>
+      <w:r>
+        <w:t xml:space="preserve">A one-line fix does not carry the same obligation</w:t>
+      </w:r>
+      <w:r>
+        <w:t xml:space="preserve"> </w:t>
+      </w:r>
+      <w:r>
+        <w:t xml:space="preserve">as a change to an authorization path, and the cheap answer errs strict rather than convenient.</w:t>
+      </w:r>
+    </w:p>
+    <w:p>
+      <w:pPr>
+        <w:pStyle w:val="Compact"/>
+        <w:numPr>
+          <w:ilvl w:val="0"/>
+          <w:numId w:val="1002"/>
+        </w:numPr>
+      </w:pPr>
+      <w:r>
+        <w:rPr>
+          <w:b/>
+          <w:bCs/>
+        </w:rPr>
+        <w:t xml:space="preserve">Wording you can actually publish.</w:t>
+      </w:r>
+      <w:r>
+        <w:t xml:space="preserve"> </w:t>
+      </w:r>
+      <w:r>
+        <w:t xml:space="preserve">Approved phrasings sit next to the overclaims they replace,</w:t>
+      </w:r>
+      <w:r>
+        <w:t xml:space="preserve"> </w:t>
+      </w:r>
+      <w:r>
+        <w:t xml:space="preserve">with a rule for saying what a gate does not prove. That rule is what stops a document being</w:t>
+      </w:r>
+      <w:r>
+        <w:t xml:space="preserve"> </w:t>
+      </w:r>
+      <w:r>
+        <w:t xml:space="preserve">rejected by the first reader who checks its sources.</w:t>
+      </w:r>
+    </w:p>
+    <w:p>
+      <w:pPr>
+        <w:pStyle w:val="Compact"/>
+        <w:numPr>
+          <w:ilvl w:val="0"/>
+          <w:numId w:val="1002"/>
+        </w:numPr>
+      </w:pPr>
+      <w:r>
+        <w:rPr>
+          <w:b/>
+          <w:bCs/>
+        </w:rPr>
+        <w:t xml:space="preserve">The claims that failed verification, published next to the ones that survived.</w:t>
+      </w:r>
+      <w:r>
+        <w:t xml:space="preserve"> </w:t>
+      </w:r>
+      <w:r>
+        <w:t xml:space="preserve">Specific</w:t>
+      </w:r>
+      <w:r>
+        <w:t xml:space="preserve"> </w:t>
+      </w:r>
+      <w:r>
+        <w:t xml:space="preserve">numbers to stop repeating, including several that circulate widely and did not survive the filter.</w:t>
+      </w:r>
+    </w:p>
+    <w:bookmarkEnd w:id="41"/>
+    <w:bookmarkStart w:id="43" w:name="what-these-are-not"/>
+    <w:p>
+      <w:pPr>
+        <w:pStyle w:val="Heading2"/>
+      </w:pPr>
+      <w:r>
+        <w:t xml:space="preserve">What these are not</w:t>
       </w:r>
     </w:p>
     <w:p>
@@ -1330,31 +1562,19 @@
           <w:b/>
           <w:bCs/>
         </w:rPr>
-        <w:t xml:space="preserve">A rubric you can run against your own repository at each release.</w:t>
-      </w:r>
-      <w:r>
-        <w:t xml:space="preserve"> </w:t>
-      </w:r>
-      <w:r>
-        <w:t xml:space="preserve">It separates controls that</w:t>
-      </w:r>
-      <w:r>
-        <w:t xml:space="preserve"> </w:t>
-      </w:r>
-      <w:r>
-        <w:t xml:space="preserve">may decide a verdict from measurements that may only start a conversation. So an argument about</w:t>
-      </w:r>
-      <w:r>
-        <w:t xml:space="preserve"> </w:t>
-      </w:r>
-      <w:r>
-        <w:t xml:space="preserve">"is this good enough" resolves against structure rather than against whoever quotes the largest</w:t>
-      </w:r>
-      <w:r>
-        <w:t xml:space="preserve"> </w:t>
-      </w:r>
-      <w:r>
-        <w:t xml:space="preserve">number.</w:t>
+        <w:t xml:space="preserve">No code ships with them.</w:t>
+      </w:r>
+      <w:r>
+        <w:t xml:space="preserve"> </w:t>
+      </w:r>
+      <w:r>
+        <w:t xml:space="preserve">These are rules and review procedures. Where one names a control, it</w:t>
+      </w:r>
+      <w:r>
+        <w:t xml:space="preserve"> </w:t>
+      </w:r>
+      <w:r>
+        <w:t xml:space="preserve">is describing something you would build, not something in this repository.</w:t>
       </w:r>
     </w:p>
     <w:p>
@@ -1370,233 +1590,6 @@
           <w:b/>
           <w:bCs/>
         </w:rPr>
-        <w:t xml:space="preserve">A discipline for third-party code that never asks you to read it.</w:t>
-      </w:r>
-      <w:r>
-        <w:t xml:space="preserve"> </w:t>
-      </w:r>
-      <w:r>
-        <w:t xml:space="preserve">The human effort lands at</w:t>
-      </w:r>
-      <w:r>
-        <w:t xml:space="preserve"> </w:t>
-      </w:r>
-      <w:r>
-        <w:t xml:space="preserve">exactly two moments: adopting a dependency and bumping one. The rest is machinery that runs</w:t>
-      </w:r>
-      <w:r>
-        <w:t xml:space="preserve"> </w:t>
-      </w:r>
-      <w:r>
-        <w:t xml:space="preserve">unattended until it raises something.</w:t>
-      </w:r>
-    </w:p>
-    <w:p>
-      <w:pPr>
-        <w:pStyle w:val="Compact"/>
-        <w:numPr>
-          <w:ilvl w:val="0"/>
-          <w:numId w:val="1003"/>
-        </w:numPr>
-      </w:pPr>
-      <w:r>
-        <w:rPr>
-          <w:b/>
-          <w:bCs/>
-        </w:rPr>
-        <w:t xml:space="preserve">A release an adopter can verify without trusting your account of your own process.</w:t>
-      </w:r>
-      <w:r>
-        <w:t xml:space="preserve"> </w:t>
-      </w:r>
-      <w:r>
-        <w:t xml:space="preserve">The</w:t>
-      </w:r>
-      <w:r>
-        <w:t xml:space="preserve"> </w:t>
-      </w:r>
-      <w:r>
-        <w:t xml:space="preserve">allowlist is checked before the upload rather than after it, because the upload is the</w:t>
-      </w:r>
-      <w:r>
-        <w:t xml:space="preserve"> </w:t>
-      </w:r>
-      <w:r>
-        <w:t xml:space="preserve">irreversible step.</w:t>
-      </w:r>
-    </w:p>
-    <w:p>
-      <w:pPr>
-        <w:pStyle w:val="Compact"/>
-        <w:numPr>
-          <w:ilvl w:val="0"/>
-          <w:numId w:val="1003"/>
-        </w:numPr>
-      </w:pPr>
-      <w:r>
-        <w:rPr>
-          <w:b/>
-          <w:bCs/>
-        </w:rPr>
-        <w:t xml:space="preserve">A written split between what you own and what an adopter owns</w:t>
-      </w:r>
-      <w:r>
-        <w:t xml:space="preserve">, made before you claim any</w:t>
-      </w:r>
-      <w:r>
-        <w:t xml:space="preserve"> </w:t>
-      </w:r>
-      <w:r>
-        <w:t xml:space="preserve">control. That gap is where a control ends up unowned by both sides, each assuming the other had</w:t>
-      </w:r>
-      <w:r>
-        <w:t xml:space="preserve"> </w:t>
-      </w:r>
-      <w:r>
-        <w:t xml:space="preserve">it.</w:t>
-      </w:r>
-    </w:p>
-    <w:p>
-      <w:pPr>
-        <w:pStyle w:val="Compact"/>
-        <w:numPr>
-          <w:ilvl w:val="0"/>
-          <w:numId w:val="1003"/>
-        </w:numPr>
-      </w:pPr>
-      <w:r>
-        <w:rPr>
-          <w:b/>
-          <w:bCs/>
-        </w:rPr>
-        <w:t xml:space="preserve">A risk tier you can resolve in one question.</w:t>
-      </w:r>
-      <w:r>
-        <w:t xml:space="preserve"> </w:t>
-      </w:r>
-      <w:r>
-        <w:t xml:space="preserve">A one-line fix does not carry the same obligation</w:t>
-      </w:r>
-      <w:r>
-        <w:t xml:space="preserve"> </w:t>
-      </w:r>
-      <w:r>
-        <w:t xml:space="preserve">as a change to an authorization path, and the cheap answer errs strict rather than convenient.</w:t>
-      </w:r>
-    </w:p>
-    <w:p>
-      <w:pPr>
-        <w:pStyle w:val="Compact"/>
-        <w:numPr>
-          <w:ilvl w:val="0"/>
-          <w:numId w:val="1003"/>
-        </w:numPr>
-      </w:pPr>
-      <w:r>
-        <w:rPr>
-          <w:b/>
-          <w:bCs/>
-        </w:rPr>
-        <w:t xml:space="preserve">Wording you can actually publish.</w:t>
-      </w:r>
-      <w:r>
-        <w:t xml:space="preserve"> </w:t>
-      </w:r>
-      <w:r>
-        <w:t xml:space="preserve">Approved phrasings sit next to the overclaims they replace,</w:t>
-      </w:r>
-      <w:r>
-        <w:t xml:space="preserve"> </w:t>
-      </w:r>
-      <w:r>
-        <w:t xml:space="preserve">with a rule for saying what a gate does not prove. That rule is what stops a document being</w:t>
-      </w:r>
-      <w:r>
-        <w:t xml:space="preserve"> </w:t>
-      </w:r>
-      <w:r>
-        <w:t xml:space="preserve">rejected by the first reader who checks its sources.</w:t>
-      </w:r>
-    </w:p>
-    <w:p>
-      <w:pPr>
-        <w:pStyle w:val="Compact"/>
-        <w:numPr>
-          <w:ilvl w:val="0"/>
-          <w:numId w:val="1003"/>
-        </w:numPr>
-      </w:pPr>
-      <w:r>
-        <w:rPr>
-          <w:b/>
-          <w:bCs/>
-        </w:rPr>
-        <w:t xml:space="preserve">The claims that failed verification, published next to the ones that survived.</w:t>
-      </w:r>
-      <w:r>
-        <w:t xml:space="preserve"> </w:t>
-      </w:r>
-      <w:r>
-        <w:t xml:space="preserve">Specific</w:t>
-      </w:r>
-      <w:r>
-        <w:t xml:space="preserve"> </w:t>
-      </w:r>
-      <w:r>
-        <w:t xml:space="preserve">numbers to stop repeating, including several that circulate widely and did not survive the filter.</w:t>
-      </w:r>
-    </w:p>
-    <w:bookmarkEnd w:id="35"/>
-    <w:bookmarkStart w:id="37" w:name="what-these-are-not"/>
-    <w:p>
-      <w:pPr>
-        <w:pStyle w:val="Heading2"/>
-      </w:pPr>
-      <w:r>
-        <w:t xml:space="preserve">What these are not</w:t>
-      </w:r>
-    </w:p>
-    <w:p>
-      <w:pPr>
-        <w:pStyle w:val="Compact"/>
-        <w:numPr>
-          <w:ilvl w:val="0"/>
-          <w:numId w:val="1004"/>
-        </w:numPr>
-      </w:pPr>
-      <w:r>
-        <w:rPr>
-          <w:b/>
-          <w:bCs/>
-        </w:rPr>
-        <w:t xml:space="preserve">No code ships with them.</w:t>
-      </w:r>
-      <w:r>
-        <w:t xml:space="preserve"> </w:t>
-      </w:r>
-      <w:r>
-        <w:t xml:space="preserve">These are rules and review procedures. Where one names a control, it</w:t>
-      </w:r>
-      <w:r>
-        <w:t xml:space="preserve"> </w:t>
-      </w:r>
-      <w:r>
-        <w:t xml:space="preserve">is describing something you would build, not something in this repository.</w:t>
-      </w:r>
-    </w:p>
-    <w:p>
-      <w:pPr>
-        <w:pStyle w:val="Compact"/>
-        <w:numPr>
-          <w:ilvl w:val="0"/>
-          <w:numId w:val="1004"/>
-        </w:numPr>
-      </w:pPr>
-      <w:r>
-        <w:rPr>
-          <w:b/>
-          <w:bCs/>
-        </w:rPr>
         <w:t xml:space="preserve">No certification, and no attainment.</w:t>
       </w:r>
       <w:r>
@@ -1620,7 +1613,7 @@
       <w:r>
         <w:t xml:space="preserve"> </w:t>
       </w:r>
-      <w:hyperlink r:id="rId36">
+      <w:hyperlink r:id="rId42">
         <w:r>
           <w:rPr>
             <w:rStyle w:val="Hyperlink"/>
@@ -1637,7 +1630,7 @@
         <w:pStyle w:val="Compact"/>
         <w:numPr>
           <w:ilvl w:val="0"/>
-          <w:numId w:val="1004"/>
+          <w:numId w:val="1003"/>
         </w:numPr>
       </w:pPr>
       <w:r>
@@ -1671,7 +1664,7 @@
         <w:pStyle w:val="Compact"/>
         <w:numPr>
           <w:ilvl w:val="0"/>
-          <w:numId w:val="1004"/>
+          <w:numId w:val="1003"/>
         </w:numPr>
       </w:pPr>
       <w:r>
@@ -1694,8 +1687,8 @@
         <w:t xml:space="preserve">document says where it bears on a rule.</w:t>
       </w:r>
     </w:p>
-    <w:bookmarkEnd w:id="37"/>
-    <w:bookmarkStart w:id="38" w:name="what-each-one-buys-you"/>
+    <w:bookmarkEnd w:id="43"/>
+    <w:bookmarkStart w:id="44" w:name="what-each-one-buys-you"/>
     <w:p>
       <w:pPr>
         <w:pStyle w:val="Heading2"/>
@@ -1761,6 +1754,64 @@
                 <w:rPr>
                   <w:rStyle w:val="Hyperlink"/>
                 </w:rPr>
+                <w:t xml:space="preserve">Which security standards apply to you</w:t>
+              </w:r>
+            </w:hyperlink>
+          </w:p>
+        </w:tc>
+        <w:tc>
+          <w:tcPr/>
+          <w:p>
+            <w:pPr>
+              <w:pStyle w:val="Compact"/>
+            </w:pPr>
+            <w:r>
+              <w:t xml:space="preserve">Standards sorted by who each one is addressed to -- a software producer, an organization operating systems, or an assessor -- which is the cut that settles most arguments about whether a document reaches you. What each one actually issues, since most issue nothing and people are routinely asked for certificates that do not exist. What triggers it, because these arrive attached to a contract rather than getting chosen. Every status carries the date it was checked.</w:t>
+            </w:r>
+          </w:p>
+        </w:tc>
+      </w:tr>
+      <w:tr>
+        <w:tc>
+          <w:tcPr/>
+          <w:p>
+            <w:pPr>
+              <w:pStyle w:val="Compact"/>
+            </w:pPr>
+            <w:hyperlink r:id="rId15">
+              <w:r>
+                <w:rPr>
+                  <w:rStyle w:val="Hyperlink"/>
+                </w:rPr>
+                <w:t xml:space="preserve">How to adopt these</w:t>
+              </w:r>
+            </w:hyperlink>
+          </w:p>
+        </w:tc>
+        <w:tc>
+          <w:tcPr/>
+          <w:p>
+            <w:pPr>
+              <w:pStyle w:val="Compact"/>
+            </w:pPr>
+            <w:r>
+              <w:t xml:space="preserve">Five steps, each ending in an artifact rather than a resolution. An exception recorded as a documented deviation with a compensating control and a trigger that ends it, because an exception without an ending trigger is permanent by default. Automation stated the hard way: automate, then prove each check can still fail, and count only blocking checks as coverage. A worked example run end to end, and an answer for a reader who has one afternoon.</w:t>
+            </w:r>
+          </w:p>
+        </w:tc>
+      </w:tr>
+      <w:tr>
+        <w:tc>
+          <w:tcPr/>
+          <w:p>
+            <w:pPr>
+              <w:pStyle w:val="Compact"/>
+            </w:pPr>
+            <w:hyperlink r:id="rId18">
+              <w:r>
+                <w:rPr>
+                  <w:rStyle w:val="Hyperlink"/>
+                </w:rPr>
                 <w:t xml:space="preserve">AI-assisted development</w:t>
               </w:r>
             </w:hyperlink>
@@ -1785,7 +1836,7 @@
             <w:pPr>
               <w:pStyle w:val="Compact"/>
             </w:pPr>
-            <w:hyperlink r:id="rId15">
+            <w:hyperlink r:id="rId21">
               <w:r>
                 <w:rPr>
                   <w:rStyle w:val="Hyperlink"/>
@@ -1814,7 +1865,7 @@
             <w:pPr>
               <w:pStyle w:val="Compact"/>
             </w:pPr>
-            <w:hyperlink r:id="rId18">
+            <w:hyperlink r:id="rId24">
               <w:r>
                 <w:rPr>
                   <w:rStyle w:val="Hyperlink"/>
@@ -1843,7 +1894,7 @@
             <w:pPr>
               <w:pStyle w:val="Compact"/>
             </w:pPr>
-            <w:hyperlink r:id="rId27">
+            <w:hyperlink r:id="rId33">
               <w:r>
                 <w:rPr>
                   <w:rStyle w:val="Hyperlink"/>
@@ -1872,7 +1923,7 @@
             <w:pPr>
               <w:pStyle w:val="Compact"/>
             </w:pPr>
-            <w:hyperlink r:id="rId21">
+            <w:hyperlink r:id="rId27">
               <w:r>
                 <w:rPr>
                   <w:rStyle w:val="Hyperlink"/>
@@ -1901,7 +1952,7 @@
             <w:pPr>
               <w:pStyle w:val="Compact"/>
             </w:pPr>
-            <w:hyperlink r:id="rId24">
+            <w:hyperlink r:id="rId30">
               <w:r>
                 <w:rPr>
                   <w:rStyle w:val="Hyperlink"/>
@@ -1924,8 +1975,8 @@
         </w:tc>
       </w:tr>
     </w:tbl>
-    <w:bookmarkEnd w:id="38"/>
-    <w:bookmarkStart w:id="39" w:name="Xcb356c1caa9fbeda96ee2c63dcee98915ebf571"/>
+    <w:bookmarkEnd w:id="44"/>
+    <w:bookmarkStart w:id="45" w:name="Xcb356c1caa9fbeda96ee2c63dcee98915ebf571"/>
     <w:p>
       <w:pPr>
         <w:pStyle w:val="Heading2"/>
@@ -1997,7 +2048,7 @@
         <w:pStyle w:val="Compact"/>
         <w:numPr>
           <w:ilvl w:val="0"/>
-          <w:numId w:val="1005"/>
+          <w:numId w:val="1004"/>
         </w:numPr>
       </w:pPr>
       <w:r>
@@ -2037,7 +2088,7 @@
         <w:pStyle w:val="Compact"/>
         <w:numPr>
           <w:ilvl w:val="0"/>
-          <w:numId w:val="1005"/>
+          <w:numId w:val="1004"/>
         </w:numPr>
       </w:pPr>
       <w:r>
@@ -2071,7 +2122,7 @@
         <w:pStyle w:val="Compact"/>
         <w:numPr>
           <w:ilvl w:val="0"/>
-          <w:numId w:val="1005"/>
+          <w:numId w:val="1004"/>
         </w:numPr>
       </w:pPr>
       <w:r>
@@ -2112,8 +2163,8 @@
         <w:t xml:space="preserve">disguised, so the set is not a complete account of the practice it came from.</w:t>
       </w:r>
     </w:p>
-    <w:bookmarkEnd w:id="39"/>
-    <w:bookmarkStart w:id="42" w:name="what-is-already-elsewhere-on-this-site"/>
+    <w:bookmarkEnd w:id="45"/>
+    <w:bookmarkStart w:id="48" w:name="what-is-already-elsewhere-on-this-site"/>
     <w:p>
       <w:pPr>
         <w:pStyle w:val="Heading2"/>
@@ -2135,10 +2186,10 @@
         <w:pStyle w:val="Compact"/>
         <w:numPr>
           <w:ilvl w:val="0"/>
-          <w:numId w:val="1006"/>
+          <w:numId w:val="1005"/>
         </w:numPr>
       </w:pPr>
-      <w:hyperlink r:id="rId36">
+      <w:hyperlink r:id="rId42">
         <w:r>
           <w:rPr>
             <w:rStyle w:val="Hyperlink"/>
@@ -2170,10 +2221,10 @@
         <w:pStyle w:val="Compact"/>
         <w:numPr>
           <w:ilvl w:val="0"/>
-          <w:numId w:val="1006"/>
+          <w:numId w:val="1005"/>
         </w:numPr>
       </w:pPr>
-      <w:hyperlink r:id="rId40">
+      <w:hyperlink r:id="rId46">
         <w:r>
           <w:rPr>
             <w:rStyle w:val="Hyperlink"/>
@@ -2199,10 +2250,10 @@
         <w:pStyle w:val="Compact"/>
         <w:numPr>
           <w:ilvl w:val="0"/>
-          <w:numId w:val="1006"/>
+          <w:numId w:val="1005"/>
         </w:numPr>
       </w:pPr>
-      <w:hyperlink r:id="rId27">
+      <w:hyperlink r:id="rId33">
         <w:r>
           <w:rPr>
             <w:rStyle w:val="Hyperlink"/>
@@ -2234,10 +2285,10 @@
         <w:pStyle w:val="Compact"/>
         <w:numPr>
           <w:ilvl w:val="0"/>
-          <w:numId w:val="1006"/>
+          <w:numId w:val="1005"/>
         </w:numPr>
       </w:pPr>
-      <w:hyperlink r:id="rId41">
+      <w:hyperlink r:id="rId47">
         <w:r>
           <w:rPr>
             <w:rStyle w:val="Hyperlink"/>
@@ -2258,8 +2309,8 @@
         <w:t xml:space="preserve">guardrail and proving it can see what it claims to.</w:t>
       </w:r>
     </w:p>
-    <w:bookmarkEnd w:id="42"/>
-    <w:bookmarkEnd w:id="43"/>
+    <w:bookmarkEnd w:id="48"/>
+    <w:bookmarkEnd w:id="49"/>
     <w:sectPr>
       <w:footnotePr>
         <w:numRestart w:val="eachSect"/>
@@ -2370,6 +2421,91 @@
       </w:pPr>
     </w:lvl>
   </w:abstractNum>
+  <w:abstractNum w:abstractNumId="99411">
+    <w:nsid w:val="00A99411"/>
+    <w:multiLevelType w:val="multilevel"/>
+    <w:lvl w:ilvl="0">
+      <w:start w:val="1"/>
+      <w:numFmt w:val="decimal"/>
+      <w:lvlText w:val="%1."/>
+      <w:lvlJc w:val="left"/>
+      <w:pPr>
+        <w:ind w:left="720" w:hanging="360"/>
+      </w:pPr>
+    </w:lvl>
+    <w:lvl w:ilvl="1">
+      <w:start w:val="1"/>
+      <w:numFmt w:val="decimal"/>
+      <w:lvlText w:val="%2."/>
+      <w:lvlJc w:val="left"/>
+      <w:pPr>
+        <w:ind w:left="1440" w:hanging="360"/>
+      </w:pPr>
+    </w:lvl>
+    <w:lvl w:ilvl="2">
+      <w:start w:val="1"/>
+      <w:numFmt w:val="decimal"/>
+      <w:lvlText w:val="%3."/>
+      <w:lvlJc w:val="left"/>
+      <w:pPr>
+        <w:ind w:left="2160" w:hanging="360"/>
+      </w:pPr>
+    </w:lvl>
+    <w:lvl w:ilvl="3">
+      <w:start w:val="1"/>
+      <w:numFmt w:val="decimal"/>
+      <w:lvlText w:val="%4."/>
+      <w:lvlJc w:val="left"/>
+      <w:pPr>
+        <w:ind w:left="2880" w:hanging="360"/>
+      </w:pPr>
+    </w:lvl>
+    <w:lvl w:ilvl="4">
+      <w:start w:val="1"/>
+      <w:numFmt w:val="decimal"/>
+      <w:lvlText w:val="%5."/>
+      <w:lvlJc w:val="left"/>
+      <w:pPr>
+        <w:ind w:left="3600" w:hanging="360"/>
+      </w:pPr>
+    </w:lvl>
+    <w:lvl w:ilvl="5">
+      <w:start w:val="1"/>
+      <w:numFmt w:val="decimal"/>
+      <w:lvlText w:val="%6."/>
+      <w:lvlJc w:val="left"/>
+      <w:pPr>
+        <w:ind w:left="4320" w:hanging="360"/>
+      </w:pPr>
+    </w:lvl>
+    <w:lvl w:ilvl="6">
+      <w:start w:val="1"/>
+      <w:numFmt w:val="decimal"/>
+      <w:lvlText w:val="%7."/>
+      <w:lvlJc w:val="left"/>
+      <w:pPr>
+        <w:ind w:left="5040" w:hanging="360"/>
+      </w:pPr>
+    </w:lvl>
+    <w:lvl w:ilvl="7">
+      <w:start w:val="1"/>
+      <w:numFmt w:val="decimal"/>
+      <w:lvlText w:val="%8."/>
+      <w:lvlJc w:val="left"/>
+      <w:pPr>
+        <w:ind w:left="5760" w:hanging="360"/>
+      </w:pPr>
+    </w:lvl>
+    <w:lvl w:ilvl="8">
+      <w:start w:val="1"/>
+      <w:numFmt w:val="decimal"/>
+      <w:lvlText w:val="%9."/>
+      <w:lvlJc w:val="left"/>
+      <w:pPr>
+        <w:ind w:left="6480" w:hanging="360"/>
+      </w:pPr>
+    </w:lvl>
+  </w:abstractNum>
   <w:abstractNum w:abstractNumId="991">
     <w:nsid w:val="0000A991"/>
     <w:multiLevelType w:val="multilevel"/>
@@ -2473,98 +2609,10 @@
       </w:rPr>
     </w:lvl>
   </w:abstractNum>
-  <w:abstractNum w:abstractNumId="99411">
-    <w:nsid w:val="00A99411"/>
-    <w:multiLevelType w:val="multilevel"/>
-    <w:lvl w:ilvl="0">
-      <w:start w:val="1"/>
-      <w:numFmt w:val="decimal"/>
-      <w:lvlText w:val="%1."/>
-      <w:lvlJc w:val="left"/>
-      <w:pPr>
-        <w:ind w:left="720" w:hanging="360"/>
-      </w:pPr>
-    </w:lvl>
-    <w:lvl w:ilvl="1">
-      <w:start w:val="1"/>
-      <w:numFmt w:val="decimal"/>
-      <w:lvlText w:val="%2."/>
-      <w:lvlJc w:val="left"/>
-      <w:pPr>
-        <w:ind w:left="1440" w:hanging="360"/>
-      </w:pPr>
-    </w:lvl>
-    <w:lvl w:ilvl="2">
-      <w:start w:val="1"/>
-      <w:numFmt w:val="decimal"/>
-      <w:lvlText w:val="%3."/>
-      <w:lvlJc w:val="left"/>
-      <w:pPr>
-        <w:ind w:left="2160" w:hanging="360"/>
-      </w:pPr>
-    </w:lvl>
-    <w:lvl w:ilvl="3">
-      <w:start w:val="1"/>
-      <w:numFmt w:val="decimal"/>
-      <w:lvlText w:val="%4."/>
-      <w:lvlJc w:val="left"/>
-      <w:pPr>
-        <w:ind w:left="2880" w:hanging="360"/>
-      </w:pPr>
-    </w:lvl>
-    <w:lvl w:ilvl="4">
-      <w:start w:val="1"/>
-      <w:numFmt w:val="decimal"/>
-      <w:lvlText w:val="%5."/>
-      <w:lvlJc w:val="left"/>
-      <w:pPr>
-        <w:ind w:left="3600" w:hanging="360"/>
-      </w:pPr>
-    </w:lvl>
-    <w:lvl w:ilvl="5">
-      <w:start w:val="1"/>
-      <w:numFmt w:val="decimal"/>
-      <w:lvlText w:val="%6."/>
-      <w:lvlJc w:val="left"/>
-      <w:pPr>
-        <w:ind w:left="4320" w:hanging="360"/>
-      </w:pPr>
-    </w:lvl>
-    <w:lvl w:ilvl="6">
-      <w:start w:val="1"/>
-      <w:numFmt w:val="decimal"/>
-      <w:lvlText w:val="%7."/>
-      <w:lvlJc w:val="left"/>
-      <w:pPr>
-        <w:ind w:left="5040" w:hanging="360"/>
-      </w:pPr>
-    </w:lvl>
-    <w:lvl w:ilvl="7">
-      <w:start w:val="1"/>
-      <w:numFmt w:val="decimal"/>
-      <w:lvlText w:val="%8."/>
-      <w:lvlJc w:val="left"/>
-      <w:pPr>
-        <w:ind w:left="5760" w:hanging="360"/>
-      </w:pPr>
-    </w:lvl>
-    <w:lvl w:ilvl="8">
-      <w:start w:val="1"/>
-      <w:numFmt w:val="decimal"/>
-      <w:lvlText w:val="%9."/>
-      <w:lvlJc w:val="left"/>
-      <w:pPr>
-        <w:ind w:left="6480" w:hanging="360"/>
-      </w:pPr>
-    </w:lvl>
-  </w:abstractNum>
   <w:num w:numId="1000">
     <w:abstractNumId w:val="990"/>
   </w:num>
   <w:num w:numId="1001">
-    <w:abstractNumId w:val="991"/>
-  </w:num>
-  <w:num w:numId="1002">
     <w:abstractNumId w:val="99411"/>
     <w:lvlOverride w:ilvl="0">
       <w:startOverride w:val="1"/>
@@ -2594,6 +2642,9 @@
       <w:startOverride w:val="1"/>
     </w:lvlOverride>
   </w:num>
+  <w:num w:numId="1002">
+    <w:abstractNumId w:val="991"/>
+  </w:num>
   <w:num w:numId="1003">
     <w:abstractNumId w:val="991"/>
   </w:num>
@@ -2601,9 +2652,6 @@
     <w:abstractNumId w:val="991"/>
   </w:num>
   <w:num w:numId="1005">
-    <w:abstractNumId w:val="991"/>
-  </w:num>
-  <w:num w:numId="1006">
     <w:abstractNumId w:val="991"/>
   </w:num>
 </w:numbering>

</xml_diff>

<commit_message>
docs: label the assessment page by what it is for
'Security standard assessment' names the activity, not the thing a reader is
trying to do. Renames the label to 'Use OWASP ASVS 5.0' in the four places it
acts as a label: the site nav, the homepage list, the files table and the
what-each-one-buys-you table, plus the cross-reference from the landscape
page.

The page's own title is unchanged, and the two inline citations in the
adoption page keep the old wording -- there the link is a citation inside a
sentence, where naming the standard instead of the document would read as a
reference to ASVS itself rather than to the method described here.
</commit_message>
<xml_diff>
--- a/docs/standards/word/OVERVIEW.docx
+++ b/docs/standards/word/OVERVIEW.docx
@@ -717,13 +717,13 @@
                 <w:b/>
                 <w:bCs/>
               </w:rPr>
-              <w:t xml:space="preserve">Security standard assessment</w:t>
+              <w:t xml:space="preserve">Use OWASP ASVS 5.0</w:t>
             </w:r>
             <w:r>
               <w:t xml:space="preserve"> </w:t>
             </w:r>
             <w:r>
-              <w:t xml:space="preserve">-- running one against a large standard</w:t>
+              <w:t xml:space="preserve">-- assessing a codebase against a large standard</w:t>
             </w:r>
           </w:p>
         </w:tc>
@@ -1899,7 +1899,7 @@
                 <w:rPr>
                   <w:rStyle w:val="Hyperlink"/>
                 </w:rPr>
-                <w:t xml:space="preserve">Security standard assessment</w:t>
+                <w:t xml:space="preserve">Use OWASP ASVS 5.0</w:t>
               </w:r>
             </w:hyperlink>
           </w:p>

</xml_diff>

<commit_message>
docs: say code host, not forge
'Forge' is the generic noun for a code-hosting platform, but it is jargon,
and this repository uses the same word as a verb in its security sense --
'a crafted path forges extra records in a log', 'the body can forge the
surrounding frame'. So the leak gate's 'forge tokens' reads as tokens that
have been forged rather than tokens belonging to a code host. One word, two
meanings, one of them a threat.

Replaces the ten noun uses with 'code host' or 'host-specific' across the CI
notes, leak gate, merge notes, dependency integrity and the standards
overview. The verb uses are correct and stay.

Reported by a reader who could not tell whether 'forge' was generic or a
reference to something specific -- which is the argument against it.
</commit_message>
<xml_diff>
--- a/docs/standards/word/OVERVIEW.docx
+++ b/docs/standards/word/OVERVIEW.docx
@@ -2096,7 +2096,7 @@
           <w:b/>
           <w:bCs/>
         </w:rPr>
-        <w:t xml:space="preserve">A forge with a blocking pipeline, and a repository several sessions push to at once.</w:t>
+        <w:t xml:space="preserve">A code host with a blocking pipeline, and a repository several sessions push to at once.</w:t>
       </w:r>
       <w:r>
         <w:t xml:space="preserve"> </w:t>
@@ -2108,7 +2108,7 @@
         <w:t xml:space="preserve"> </w:t>
       </w:r>
       <w:r>
-        <w:t xml:space="preserve">control placement advice assumes both. The failure shapes are not forge-specific; the field names</w:t>
+        <w:t xml:space="preserve">control placement advice assumes both. The failure shapes are not host-specific; the field names</w:t>
       </w:r>
       <w:r>
         <w:t xml:space="preserve"> </w:t>

</xml_diff>

<commit_message>
docs(standards): split the landscape page into a guide and a reference
The page ran three of Diataxis's four modes at once -- how-to in the routing
block, explanation in the two cuts, reference in the bucket sections holding
every item. Mixing modes on one page is the documented cause of confusing
documentation, and it was the reader's complaint.

The guide keeps the situation spine and answers 'which of these reach me'.
The reference is one row per document, spined for lookup, and is allowed to
be long because nobody reads it top to bottom. The explanation material sits
last and is skippable rather than scattered through both.

Adds a test pinning the selector's data against the routing table, so the app
and the markdown cannot drift apart silently. That drift would be invisible:
both would render fine and disagree.
</commit_message>
<xml_diff>
--- a/docs/standards/word/OVERVIEW.docx
+++ b/docs/standards/word/OVERVIEW.docx
@@ -28,7 +28,7 @@
         </w:p>
       </w:sdtContent>
     </w:sdt>
-    <w:bookmarkStart w:id="49" w:name="standards-you-can-start-from"/>
+    <w:bookmarkStart w:id="52" w:name="standards-you-can-start-from"/>
     <w:p>
       <w:pPr>
         <w:pStyle w:val="Heading1"/>
@@ -91,7 +91,7 @@
         <w:t xml:space="preserve">edited down to your setting before it is useful.</w:t>
       </w:r>
     </w:p>
-    <w:bookmarkStart w:id="39" w:name="the-files"/>
+    <w:bookmarkStart w:id="42" w:name="the-files"/>
     <w:p>
       <w:pPr>
         <w:pStyle w:val="Heading2"/>
@@ -250,7 +250,7 @@
               <w:t xml:space="preserve"> </w:t>
             </w:r>
             <w:r>
-              <w:t xml:space="preserve">-- a map of the landscape, for deciding what reaches you</w:t>
+              <w:t xml:space="preserve">-- the guide: which of them reach your situation, and what to check next</w:t>
             </w:r>
           </w:p>
         </w:tc>
@@ -293,6 +293,77 @@
               <w:pStyle w:val="Compact"/>
             </w:pPr>
             <w:hyperlink r:id="rId14">
+              <w:r>
+                <w:rPr>
+                  <w:rStyle w:val="Hyperlink"/>
+                </w:rPr>
+                <w:t xml:space="preserve">.docx</w:t>
+              </w:r>
+            </w:hyperlink>
+          </w:p>
+        </w:tc>
+      </w:tr>
+      <w:tr>
+        <w:tc>
+          <w:tcPr/>
+          <w:p>
+            <w:pPr>
+              <w:pStyle w:val="Compact"/>
+            </w:pPr>
+            <w:r>
+              <w:rPr>
+                <w:b/>
+                <w:bCs/>
+              </w:rPr>
+              <w:t xml:space="preserve">Security standards reference</w:t>
+            </w:r>
+            <w:r>
+              <w:t xml:space="preserve"> </w:t>
+            </w:r>
+            <w:r>
+              <w:t xml:space="preserve">-- the lookup table behind that guide: one row per document</w:t>
+            </w:r>
+          </w:p>
+        </w:tc>
+        <w:tc>
+          <w:tcPr/>
+          <w:p>
+            <w:pPr>
+              <w:pStyle w:val="Compact"/>
+            </w:pPr>
+            <w:hyperlink r:id="rId15">
+              <w:r>
+                <w:rPr>
+                  <w:rStyle w:val="Hyperlink"/>
+                </w:rPr>
+                <w:t xml:space="preserve">page</w:t>
+              </w:r>
+            </w:hyperlink>
+          </w:p>
+        </w:tc>
+        <w:tc>
+          <w:tcPr/>
+          <w:p>
+            <w:pPr>
+              <w:pStyle w:val="Compact"/>
+            </w:pPr>
+            <w:hyperlink r:id="rId16">
+              <w:r>
+                <w:rPr>
+                  <w:rStyle w:val="Hyperlink"/>
+                </w:rPr>
+                <w:t xml:space="preserve">.md</w:t>
+              </w:r>
+            </w:hyperlink>
+          </w:p>
+        </w:tc>
+        <w:tc>
+          <w:tcPr/>
+          <w:p>
+            <w:pPr>
+              <w:pStyle w:val="Compact"/>
+            </w:pPr>
+            <w:hyperlink r:id="rId17">
               <w:r>
                 <w:rPr>
                   <w:rStyle w:val="Hyperlink"/>
@@ -331,7 +402,7 @@
             <w:pPr>
               <w:pStyle w:val="Compact"/>
             </w:pPr>
-            <w:hyperlink r:id="rId15">
+            <w:hyperlink r:id="rId18">
               <w:r>
                 <w:rPr>
                   <w:rStyle w:val="Hyperlink"/>
@@ -347,7 +418,7 @@
             <w:pPr>
               <w:pStyle w:val="Compact"/>
             </w:pPr>
-            <w:hyperlink r:id="rId16">
+            <w:hyperlink r:id="rId19">
               <w:r>
                 <w:rPr>
                   <w:rStyle w:val="Hyperlink"/>
@@ -363,7 +434,7 @@
             <w:pPr>
               <w:pStyle w:val="Compact"/>
             </w:pPr>
-            <w:hyperlink r:id="rId17">
+            <w:hyperlink r:id="rId20">
               <w:r>
                 <w:rPr>
                   <w:rStyle w:val="Hyperlink"/>
@@ -396,7 +467,7 @@
             <w:pPr>
               <w:pStyle w:val="Compact"/>
             </w:pPr>
-            <w:hyperlink r:id="rId18">
+            <w:hyperlink r:id="rId21">
               <w:r>
                 <w:rPr>
                   <w:rStyle w:val="Hyperlink"/>
@@ -412,7 +483,7 @@
             <w:pPr>
               <w:pStyle w:val="Compact"/>
             </w:pPr>
-            <w:hyperlink r:id="rId19">
+            <w:hyperlink r:id="rId22">
               <w:r>
                 <w:rPr>
                   <w:rStyle w:val="Hyperlink"/>
@@ -428,7 +499,7 @@
             <w:pPr>
               <w:pStyle w:val="Compact"/>
             </w:pPr>
-            <w:hyperlink r:id="rId20">
+            <w:hyperlink r:id="rId23">
               <w:r>
                 <w:rPr>
                   <w:rStyle w:val="Hyperlink"/>
@@ -461,7 +532,7 @@
             <w:pPr>
               <w:pStyle w:val="Compact"/>
             </w:pPr>
-            <w:hyperlink r:id="rId21">
+            <w:hyperlink r:id="rId24">
               <w:r>
                 <w:rPr>
                   <w:rStyle w:val="Hyperlink"/>
@@ -477,7 +548,7 @@
             <w:pPr>
               <w:pStyle w:val="Compact"/>
             </w:pPr>
-            <w:hyperlink r:id="rId22">
+            <w:hyperlink r:id="rId25">
               <w:r>
                 <w:rPr>
                   <w:rStyle w:val="Hyperlink"/>
@@ -493,7 +564,7 @@
             <w:pPr>
               <w:pStyle w:val="Compact"/>
             </w:pPr>
-            <w:hyperlink r:id="rId23">
+            <w:hyperlink r:id="rId26">
               <w:r>
                 <w:rPr>
                   <w:rStyle w:val="Hyperlink"/>
@@ -532,7 +603,7 @@
             <w:pPr>
               <w:pStyle w:val="Compact"/>
             </w:pPr>
-            <w:hyperlink r:id="rId24">
+            <w:hyperlink r:id="rId27">
               <w:r>
                 <w:rPr>
                   <w:rStyle w:val="Hyperlink"/>
@@ -548,7 +619,7 @@
             <w:pPr>
               <w:pStyle w:val="Compact"/>
             </w:pPr>
-            <w:hyperlink r:id="rId25">
+            <w:hyperlink r:id="rId28">
               <w:r>
                 <w:rPr>
                   <w:rStyle w:val="Hyperlink"/>
@@ -564,7 +635,7 @@
             <w:pPr>
               <w:pStyle w:val="Compact"/>
             </w:pPr>
-            <w:hyperlink r:id="rId26">
+            <w:hyperlink r:id="rId29">
               <w:r>
                 <w:rPr>
                   <w:rStyle w:val="Hyperlink"/>
@@ -597,7 +668,7 @@
             <w:pPr>
               <w:pStyle w:val="Compact"/>
             </w:pPr>
-            <w:hyperlink r:id="rId27">
+            <w:hyperlink r:id="rId30">
               <w:r>
                 <w:rPr>
                   <w:rStyle w:val="Hyperlink"/>
@@ -613,7 +684,7 @@
             <w:pPr>
               <w:pStyle w:val="Compact"/>
             </w:pPr>
-            <w:hyperlink r:id="rId28">
+            <w:hyperlink r:id="rId31">
               <w:r>
                 <w:rPr>
                   <w:rStyle w:val="Hyperlink"/>
@@ -629,7 +700,7 @@
             <w:pPr>
               <w:pStyle w:val="Compact"/>
             </w:pPr>
-            <w:hyperlink r:id="rId29">
+            <w:hyperlink r:id="rId32">
               <w:r>
                 <w:rPr>
                   <w:rStyle w:val="Hyperlink"/>
@@ -662,7 +733,7 @@
             <w:pPr>
               <w:pStyle w:val="Compact"/>
             </w:pPr>
-            <w:hyperlink r:id="rId30">
+            <w:hyperlink r:id="rId33">
               <w:r>
                 <w:rPr>
                   <w:rStyle w:val="Hyperlink"/>
@@ -678,7 +749,7 @@
             <w:pPr>
               <w:pStyle w:val="Compact"/>
             </w:pPr>
-            <w:hyperlink r:id="rId31">
+            <w:hyperlink r:id="rId34">
               <w:r>
                 <w:rPr>
                   <w:rStyle w:val="Hyperlink"/>
@@ -694,7 +765,7 @@
             <w:pPr>
               <w:pStyle w:val="Compact"/>
             </w:pPr>
-            <w:hyperlink r:id="rId32">
+            <w:hyperlink r:id="rId35">
               <w:r>
                 <w:rPr>
                   <w:rStyle w:val="Hyperlink"/>
@@ -733,7 +804,7 @@
             <w:pPr>
               <w:pStyle w:val="Compact"/>
             </w:pPr>
-            <w:hyperlink r:id="rId33">
+            <w:hyperlink r:id="rId36">
               <w:r>
                 <w:rPr>
                   <w:rStyle w:val="Hyperlink"/>
@@ -749,7 +820,7 @@
             <w:pPr>
               <w:pStyle w:val="Compact"/>
             </w:pPr>
-            <w:hyperlink r:id="rId34">
+            <w:hyperlink r:id="rId37">
               <w:r>
                 <w:rPr>
                   <w:rStyle w:val="Hyperlink"/>
@@ -765,7 +836,7 @@
             <w:pPr>
               <w:pStyle w:val="Compact"/>
             </w:pPr>
-            <w:hyperlink r:id="rId35">
+            <w:hyperlink r:id="rId38">
               <w:r>
                 <w:rPr>
                   <w:rStyle w:val="Hyperlink"/>
@@ -805,7 +876,7 @@
             <w:pPr>
               <w:pStyle w:val="Compact"/>
             </w:pPr>
-            <w:hyperlink r:id="rId36">
+            <w:hyperlink r:id="rId39">
               <w:r>
                 <w:rPr>
                   <w:rStyle w:val="Hyperlink"/>
@@ -821,7 +892,7 @@
             <w:pPr>
               <w:pStyle w:val="Compact"/>
             </w:pPr>
-            <w:hyperlink r:id="rId37">
+            <w:hyperlink r:id="rId40">
               <w:r>
                 <w:rPr>
                   <w:rStyle w:val="Hyperlink"/>
@@ -915,7 +986,7 @@
             <w:pPr>
               <w:pStyle w:val="Compact"/>
             </w:pPr>
-            <w:hyperlink r:id="rId38">
+            <w:hyperlink r:id="rId41">
               <w:r>
                 <w:rPr>
                   <w:rStyle w:val="Hyperlink"/>
@@ -950,8 +1021,8 @@
         <w:t xml:space="preserve">Markdown is best for sharing with AI. Word is best for sharing with humans.</w:t>
       </w:r>
     </w:p>
-    <w:bookmarkEnd w:id="39"/>
-    <w:bookmarkStart w:id="40" w:name="the-order-to-read-them-in"/>
+    <w:bookmarkEnd w:id="42"/>
+    <w:bookmarkStart w:id="43" w:name="the-order-to-read-them-in"/>
     <w:p>
       <w:pPr>
         <w:pStyle w:val="Heading2"/>
@@ -968,7 +1039,7 @@
           <w:numId w:val="1001"/>
         </w:numPr>
       </w:pPr>
-      <w:hyperlink r:id="rId18">
+      <w:hyperlink r:id="rId21">
         <w:r>
           <w:rPr>
             <w:rStyle w:val="Hyperlink"/>
@@ -1005,7 +1076,7 @@
           <w:numId w:val="1001"/>
         </w:numPr>
       </w:pPr>
-      <w:hyperlink r:id="rId24">
+      <w:hyperlink r:id="rId27">
         <w:r>
           <w:rPr>
             <w:rStyle w:val="Hyperlink"/>
@@ -1036,7 +1107,7 @@
           <w:numId w:val="1001"/>
         </w:numPr>
       </w:pPr>
-      <w:hyperlink r:id="rId21">
+      <w:hyperlink r:id="rId24">
         <w:r>
           <w:rPr>
             <w:rStyle w:val="Hyperlink"/>
@@ -1073,7 +1144,7 @@
           <w:numId w:val="1001"/>
         </w:numPr>
       </w:pPr>
-      <w:hyperlink r:id="rId27">
+      <w:hyperlink r:id="rId30">
         <w:r>
           <w:rPr>
             <w:rStyle w:val="Hyperlink"/>
@@ -1104,7 +1175,7 @@
           <w:numId w:val="1001"/>
         </w:numPr>
       </w:pPr>
-      <w:hyperlink r:id="rId30">
+      <w:hyperlink r:id="rId33">
         <w:r>
           <w:rPr>
             <w:rStyle w:val="Hyperlink"/>
@@ -1161,7 +1232,7 @@
       <w:r>
         <w:t xml:space="preserve"> </w:t>
       </w:r>
-      <w:hyperlink r:id="rId24">
+      <w:hyperlink r:id="rId27">
         <w:r>
           <w:rPr>
             <w:rStyle w:val="Hyperlink"/>
@@ -1279,7 +1350,7 @@
       <w:r>
         <w:t xml:space="preserve"> </w:t>
       </w:r>
-      <w:hyperlink r:id="rId38">
+      <w:hyperlink r:id="rId41">
         <w:r>
           <w:rPr>
             <w:rStyle w:val="Hyperlink"/>
@@ -1300,8 +1371,8 @@
         <w:t xml:space="preserve">able to fail. A standard that no such file references is a document, not a practice.</w:t>
       </w:r>
     </w:p>
-    <w:bookmarkEnd w:id="40"/>
-    <w:bookmarkStart w:id="41" w:name="what-you-get"/>
+    <w:bookmarkEnd w:id="43"/>
+    <w:bookmarkStart w:id="44" w:name="what-you-get"/>
     <w:p>
       <w:pPr>
         <w:pStyle w:val="Heading2"/>
@@ -1539,8 +1610,8 @@
         <w:t xml:space="preserve">numbers to stop repeating, including several that circulate widely and did not survive the filter.</w:t>
       </w:r>
     </w:p>
-    <w:bookmarkEnd w:id="41"/>
-    <w:bookmarkStart w:id="43" w:name="what-these-are-not"/>
+    <w:bookmarkEnd w:id="44"/>
+    <w:bookmarkStart w:id="46" w:name="what-these-are-not"/>
     <w:p>
       <w:pPr>
         <w:pStyle w:val="Heading2"/>
@@ -1613,7 +1684,7 @@
       <w:r>
         <w:t xml:space="preserve"> </w:t>
       </w:r>
-      <w:hyperlink r:id="rId42">
+      <w:hyperlink r:id="rId45">
         <w:r>
           <w:rPr>
             <w:rStyle w:val="Hyperlink"/>
@@ -1687,8 +1758,8 @@
         <w:t xml:space="preserve">document says where it bears on a rule.</w:t>
       </w:r>
     </w:p>
-    <w:bookmarkEnd w:id="43"/>
-    <w:bookmarkStart w:id="44" w:name="what-each-one-buys-you"/>
+    <w:bookmarkEnd w:id="46"/>
+    <w:bookmarkStart w:id="47" w:name="what-each-one-buys-you"/>
     <w:p>
       <w:pPr>
         <w:pStyle w:val="Heading2"/>
@@ -1766,7 +1837,7 @@
               <w:pStyle w:val="Compact"/>
             </w:pPr>
             <w:r>
-              <w:t xml:space="preserve">Standards sorted by who each one is addressed to -- a software producer, an organization operating systems, or an assessor -- which is the cut that settles most arguments about whether a document reaches you. What each one actually issues, since most issue nothing and people are routinely asked for certificates that do not exist. What triggers it, because these arrive attached to a contract rather than getting chosen. Every status carries the date it was checked.</w:t>
+              <w:t xml:space="preserve">The guide, organized around your situation rather than around the documents. Which of them can reach you and by which route, since these arrive attached to a contract rather than getting chosen. Why an organization-layer certificate is not evidence about software. What the map does not cover, said out loud. On the served site it carries an interactive selector: tick what is true of your business and it hides what cannot reach you. It hides; it never computes, and it issues no verdict.</w:t>
             </w:r>
           </w:p>
         </w:tc>
@@ -1783,19 +1854,19 @@
                 <w:rPr>
                   <w:rStyle w:val="Hyperlink"/>
                 </w:rPr>
-                <w:t xml:space="preserve">How to adopt these</w:t>
-              </w:r>
-            </w:hyperlink>
-          </w:p>
-        </w:tc>
-        <w:tc>
-          <w:tcPr/>
-          <w:p>
-            <w:pPr>
-              <w:pStyle w:val="Compact"/>
-            </w:pPr>
-            <w:r>
-              <w:t xml:space="preserve">Five steps, each ending in an artifact rather than a resolution. An exception recorded as a documented deviation with a compensating control and a trigger that ends it, because an exception without an ending trigger is permanent by default. Automation stated the hard way: automate, then prove each check can still fail, and count only blocking checks as coverage. A worked example run end to end, and an answer for a reader who has one afternoon.</w:t>
+                <w:t xml:space="preserve">Security standards reference</w:t>
+              </w:r>
+            </w:hyperlink>
+          </w:p>
+        </w:tc>
+        <w:tc>
+          <w:tcPr/>
+          <w:p>
+            <w:pPr>
+              <w:pStyle w:val="Compact"/>
+            </w:pPr>
+            <w:r>
+              <w:t xml:space="preserve">The lookup table behind that guide, sorted by who each document is addressed to -- a software producer, an organization operating systems, an assessor, or nobody. What each one actually issues, since most issue nothing and people are routinely asked for certificates that do not exist. What triggers it. A check you can run yourself instead of trusting the page. Every status carries the date it was checked.</w:t>
             </w:r>
           </w:p>
         </w:tc>
@@ -1812,19 +1883,19 @@
                 <w:rPr>
                   <w:rStyle w:val="Hyperlink"/>
                 </w:rPr>
-                <w:t xml:space="preserve">AI-assisted development</w:t>
-              </w:r>
-            </w:hyperlink>
-          </w:p>
-        </w:tc>
-        <w:tc>
-          <w:tcPr/>
-          <w:p>
-            <w:pPr>
-              <w:pStyle w:val="Compact"/>
-            </w:pPr>
-            <w:r>
-              <w:t xml:space="preserve">Five named process failure modes as an organizing spine. A tier ladder that says how much rigor this particular change needs. The hard line between a control and a wish: a gate is a deterministic check, and the model never certifies its own output. An adversarial verification pass written as a technique, including the cases where it is pure waste.</w:t>
+                <w:t xml:space="preserve">How to adopt these</w:t>
+              </w:r>
+            </w:hyperlink>
+          </w:p>
+        </w:tc>
+        <w:tc>
+          <w:tcPr/>
+          <w:p>
+            <w:pPr>
+              <w:pStyle w:val="Compact"/>
+            </w:pPr>
+            <w:r>
+              <w:t xml:space="preserve">Five steps, each ending in an artifact rather than a resolution. An exception recorded as a documented deviation with a compensating control and a trigger that ends it, because an exception without an ending trigger is permanent by default. Automation stated the hard way: automate, then prove each check can still fail, and count only blocking checks as coverage. A worked example run end to end, and an answer for a reader who has one afternoon.</w:t>
             </w:r>
           </w:p>
         </w:tc>
@@ -1841,19 +1912,19 @@
                 <w:rPr>
                   <w:rStyle w:val="Hyperlink"/>
                 </w:rPr>
-                <w:t xml:space="preserve">Dependency integrity</w:t>
-              </w:r>
-            </w:hyperlink>
-          </w:p>
-        </w:tc>
-        <w:tc>
-          <w:tcPr/>
-          <w:p>
-            <w:pPr>
-              <w:pStyle w:val="Compact"/>
-            </w:pPr>
-            <w:r>
-              <w:t xml:space="preserve">Two directions in one document. Inbound: third-party code held as a black box you deliberately do not source-review, with the obligation made finite and the human effort concentrated at adoption and at each bump. Outbound: a published build that contains only what you declared, verifiable by the person installing it.</w:t>
+                <w:t xml:space="preserve">AI-assisted development</w:t>
+              </w:r>
+            </w:hyperlink>
+          </w:p>
+        </w:tc>
+        <w:tc>
+          <w:tcPr/>
+          <w:p>
+            <w:pPr>
+              <w:pStyle w:val="Compact"/>
+            </w:pPr>
+            <w:r>
+              <w:t xml:space="preserve">Five named process failure modes as an organizing spine. A tier ladder that says how much rigor this particular change needs. The hard line between a control and a wish: a gate is a deterministic check, and the model never certifies its own output. An adversarial verification pass written as a technique, including the cases where it is pure waste.</w:t>
             </w:r>
           </w:p>
         </w:tc>
@@ -1870,19 +1941,19 @@
                 <w:rPr>
                   <w:rStyle w:val="Hyperlink"/>
                 </w:rPr>
-                <w:t xml:space="preserve">Human review of code</w:t>
-              </w:r>
-            </w:hyperlink>
-          </w:p>
-        </w:tc>
-        <w:tc>
-          <w:tcPr/>
-          <w:p>
-            <w:pPr>
-              <w:pStyle w:val="Compact"/>
-            </w:pPr>
-            <w:r>
-              <w:t xml:space="preserve">The answer to "how much of this must a human read" that is not a percentage. Depth resolved per change by risk tier, a sensitive-data ratchet that dominates size, and an unknown-clamps-up rule. Two conditions that force a full line-by-line read regardless. The contested question of whether explaining code with the AI coding assistant's help satisfies the floor.</w:t>
+                <w:t xml:space="preserve">Dependency integrity</w:t>
+              </w:r>
+            </w:hyperlink>
+          </w:p>
+        </w:tc>
+        <w:tc>
+          <w:tcPr/>
+          <w:p>
+            <w:pPr>
+              <w:pStyle w:val="Compact"/>
+            </w:pPr>
+            <w:r>
+              <w:t xml:space="preserve">Two directions in one document. Inbound: third-party code held as a black box you deliberately do not source-review, with the obligation made finite and the human effort concentrated at adoption and at each bump. Outbound: a published build that contains only what you declared, verifiable by the person installing it.</w:t>
             </w:r>
           </w:p>
         </w:tc>
@@ -1894,24 +1965,24 @@
             <w:pPr>
               <w:pStyle w:val="Compact"/>
             </w:pPr>
-            <w:hyperlink r:id="rId33">
-              <w:r>
-                <w:rPr>
-                  <w:rStyle w:val="Hyperlink"/>
-                </w:rPr>
-                <w:t xml:space="preserve">Use OWASP ASVS 5.0</w:t>
-              </w:r>
-            </w:hyperlink>
-          </w:p>
-        </w:tc>
-        <w:tc>
-          <w:tcPr/>
-          <w:p>
-            <w:pPr>
-              <w:pStyle w:val="Compact"/>
-            </w:pPr>
-            <w:r>
-              <w:t xml:space="preserve">A method for assessing a codebase against a standard with several hundred requirements. Verdict vocabularies that mean the same thing to two reviewers, and evidence anchors a machine can re-check. Pinning the standard's corpus so it cannot shift underneath you, and how to read a movement in a score.</w:t>
+            <w:hyperlink r:id="rId27">
+              <w:r>
+                <w:rPr>
+                  <w:rStyle w:val="Hyperlink"/>
+                </w:rPr>
+                <w:t xml:space="preserve">Human review of code</w:t>
+              </w:r>
+            </w:hyperlink>
+          </w:p>
+        </w:tc>
+        <w:tc>
+          <w:tcPr/>
+          <w:p>
+            <w:pPr>
+              <w:pStyle w:val="Compact"/>
+            </w:pPr>
+            <w:r>
+              <w:t xml:space="preserve">The answer to "how much of this must a human read" that is not a percentage. Depth resolved per change by risk tier, a sensitive-data ratchet that dominates size, and an unknown-clamps-up rule. Two conditions that force a full line-by-line read regardless. The contested question of whether explaining code with the AI coding assistant's help satisfies the floor.</w:t>
             </w:r>
           </w:p>
         </w:tc>
@@ -1923,24 +1994,24 @@
             <w:pPr>
               <w:pStyle w:val="Compact"/>
             </w:pPr>
-            <w:hyperlink r:id="rId27">
-              <w:r>
-                <w:rPr>
-                  <w:rStyle w:val="Hyperlink"/>
-                </w:rPr>
-                <w:t xml:space="preserve">Code quality</w:t>
-              </w:r>
-            </w:hyperlink>
-          </w:p>
-        </w:tc>
-        <w:tc>
-          <w:tcPr/>
-          <w:p>
-            <w:pPr>
-              <w:pStyle w:val="Compact"/>
-            </w:pPr>
-            <w:r>
-              <w:t xml:space="preserve">Rows that may decide a verdict, separated from rows that may only start a conversation. The published evidence behind refusing to gate on a single number. A map from each way machine-written code goes wrong to the control that neutralizes it. Review depth as a per-file decision, so a large diff stays finite.</w:t>
+            <w:hyperlink r:id="rId36">
+              <w:r>
+                <w:rPr>
+                  <w:rStyle w:val="Hyperlink"/>
+                </w:rPr>
+                <w:t xml:space="preserve">Use OWASP ASVS 5.0</w:t>
+              </w:r>
+            </w:hyperlink>
+          </w:p>
+        </w:tc>
+        <w:tc>
+          <w:tcPr/>
+          <w:p>
+            <w:pPr>
+              <w:pStyle w:val="Compact"/>
+            </w:pPr>
+            <w:r>
+              <w:t xml:space="preserve">A method for assessing a codebase against a standard with several hundred requirements. Verdict vocabularies that mean the same thing to two reviewers, and evidence anchors a machine can re-check. Pinning the standard's corpus so it cannot shift underneath you, and how to read a movement in a score.</w:t>
             </w:r>
           </w:p>
         </w:tc>
@@ -1957,6 +2028,35 @@
                 <w:rPr>
                   <w:rStyle w:val="Hyperlink"/>
                 </w:rPr>
+                <w:t xml:space="preserve">Code quality</w:t>
+              </w:r>
+            </w:hyperlink>
+          </w:p>
+        </w:tc>
+        <w:tc>
+          <w:tcPr/>
+          <w:p>
+            <w:pPr>
+              <w:pStyle w:val="Compact"/>
+            </w:pPr>
+            <w:r>
+              <w:t xml:space="preserve">Rows that may decide a verdict, separated from rows that may only start a conversation. The published evidence behind refusing to gate on a single number. A map from each way machine-written code goes wrong to the control that neutralizes it. Review depth as a per-file decision, so a large diff stays finite.</w:t>
+            </w:r>
+          </w:p>
+        </w:tc>
+      </w:tr>
+      <w:tr>
+        <w:tc>
+          <w:tcPr/>
+          <w:p>
+            <w:pPr>
+              <w:pStyle w:val="Compact"/>
+            </w:pPr>
+            <w:hyperlink r:id="rId33">
+              <w:r>
+                <w:rPr>
+                  <w:rStyle w:val="Hyperlink"/>
+                </w:rPr>
                 <w:t xml:space="preserve">Secure development</w:t>
               </w:r>
             </w:hyperlink>
@@ -1975,8 +2075,8 @@
         </w:tc>
       </w:tr>
     </w:tbl>
-    <w:bookmarkEnd w:id="44"/>
-    <w:bookmarkStart w:id="45" w:name="Xcb356c1caa9fbeda96ee2c63dcee98915ebf571"/>
+    <w:bookmarkEnd w:id="47"/>
+    <w:bookmarkStart w:id="48" w:name="Xcb356c1caa9fbeda96ee2c63dcee98915ebf571"/>
     <w:p>
       <w:pPr>
         <w:pStyle w:val="Heading2"/>
@@ -2163,8 +2263,8 @@
         <w:t xml:space="preserve">disguised, so the set is not a complete account of the practice it came from.</w:t>
       </w:r>
     </w:p>
-    <w:bookmarkEnd w:id="45"/>
-    <w:bookmarkStart w:id="48" w:name="what-is-already-elsewhere-on-this-site"/>
+    <w:bookmarkEnd w:id="48"/>
+    <w:bookmarkStart w:id="51" w:name="what-is-already-elsewhere-on-this-site"/>
     <w:p>
       <w:pPr>
         <w:pStyle w:val="Heading2"/>
@@ -2189,7 +2289,7 @@
           <w:numId w:val="1005"/>
         </w:numPr>
       </w:pPr>
-      <w:hyperlink r:id="rId42">
+      <w:hyperlink r:id="rId45">
         <w:r>
           <w:rPr>
             <w:rStyle w:val="Hyperlink"/>
@@ -2224,7 +2324,7 @@
           <w:numId w:val="1005"/>
         </w:numPr>
       </w:pPr>
-      <w:hyperlink r:id="rId46">
+      <w:hyperlink r:id="rId49">
         <w:r>
           <w:rPr>
             <w:rStyle w:val="Hyperlink"/>
@@ -2253,7 +2353,7 @@
           <w:numId w:val="1005"/>
         </w:numPr>
       </w:pPr>
-      <w:hyperlink r:id="rId33">
+      <w:hyperlink r:id="rId36">
         <w:r>
           <w:rPr>
             <w:rStyle w:val="Hyperlink"/>
@@ -2288,7 +2388,7 @@
           <w:numId w:val="1005"/>
         </w:numPr>
       </w:pPr>
-      <w:hyperlink r:id="rId47">
+      <w:hyperlink r:id="rId50">
         <w:r>
           <w:rPr>
             <w:rStyle w:val="Hyperlink"/>
@@ -2309,8 +2409,8 @@
         <w:t xml:space="preserve">guardrail and proving it can see what it claims to.</w:t>
       </w:r>
     </w:p>
-    <w:bookmarkEnd w:id="48"/>
-    <w:bookmarkEnd w:id="49"/>
+    <w:bookmarkEnd w:id="51"/>
+    <w:bookmarkEnd w:id="52"/>
     <w:sectPr>
       <w:footnotePr>
         <w:numRestart w:val="eachSect"/>

</xml_diff>

<commit_message>
docs(standards): the last download row with no description was the widest document
Three of the four bare rows got a description in f8b06e2; secure development
was the fourth and stayed bare, so the table was still half-annotated for the
one document a reader is least able to guess the shape of from its name.

Word copy regenerated with pandoc 3.10.

Co-Authored-By: Claude Opus 5 <noreply@anthropic.com>
</commit_message>
<xml_diff>
--- a/docs/standards/word/OVERVIEW.docx
+++ b/docs/standards/word/OVERVIEW.docx
@@ -884,6 +884,12 @@
                 <w:bCs/>
               </w:rPr>
               <w:t xml:space="preserve">Secure development</w:t>
+            </w:r>
+            <w:r>
+              <w:t xml:space="preserve"> </w:t>
+            </w:r>
+            <w:r>
+              <w:t xml:space="preserve">-- the process a build must satisfy, from the threat model to the release gate, and what you may claim once it does</w:t>
             </w:r>
           </w:p>
         </w:tc>

</xml_diff>